<commit_message>
Year added in modules
</commit_message>
<xml_diff>
--- a/templates/andhra pradesh/trial_court/suit-injunction.docx
+++ b/templates/andhra pradesh/trial_court/suit-injunction.docx
@@ -1,6 +1,6 @@
 
 <file path=word/document.xml><?xml version="1.0" encoding="utf-8"?>
-<w:document xmlns:wpc="http://schemas.microsoft.com/office/word/2010/wordprocessingCanvas" xmlns:cx="http://schemas.microsoft.com/office/drawing/2014/chartex" xmlns:cx1="http://schemas.microsoft.com/office/drawing/2015/9/8/chartex" xmlns:cx2="http://schemas.microsoft.com/office/drawing/2015/10/21/chartex" xmlns:cx3="http://schemas.microsoft.com/office/drawing/2016/5/9/chartex" xmlns:cx4="http://schemas.microsoft.com/office/drawing/2016/5/10/chartex" xmlns:cx5="http://schemas.microsoft.com/office/drawing/2016/5/11/chartex" xmlns:cx6="http://schemas.microsoft.com/office/drawing/2016/5/12/chartex" xmlns:cx7="http://schemas.microsoft.com/office/drawing/2016/5/13/chartex" xmlns:cx8="http://schemas.microsoft.com/office/drawing/2016/5/14/chartex" xmlns:mc="http://schemas.openxmlformats.org/markup-compatibility/2006" xmlns:aink="http://schemas.microsoft.com/office/drawing/2016/ink" xmlns:am3d="http://schemas.microsoft.com/office/drawing/2017/model3d" xmlns:o="urn:schemas-microsoft-com:office:office" xmlns:oel="http://schemas.microsoft.com/office/2019/extlst" xmlns:r="http://schemas.openxmlformats.org/officeDocument/2006/relationships" xmlns:m="http://schemas.openxmlformats.org/officeDocument/2006/math" xmlns:v="urn:schemas-microsoft-com:vml" xmlns:wp14="http://schemas.microsoft.com/office/word/2010/wordprocessingDrawing" xmlns:wp="http://schemas.openxmlformats.org/drawingml/2006/wordprocessingDrawing" xmlns:w10="urn:schemas-microsoft-com:office:word" xmlns:w="http://schemas.openxmlformats.org/wordprocessingml/2006/main" xmlns:w14="http://schemas.microsoft.com/office/word/2010/wordml" xmlns:w15="http://schemas.microsoft.com/office/word/2012/wordml" xmlns:w16cex="http://schemas.microsoft.com/office/word/2018/wordml/cex" xmlns:w16cid="http://schemas.microsoft.com/office/word/2016/wordml/cid" xmlns:w16="http://schemas.microsoft.com/office/word/2018/wordml" xmlns:w16du="http://schemas.microsoft.com/office/word/2023/wordml/word16du" xmlns:w16sdtdh="http://schemas.microsoft.com/office/word/2020/wordml/sdtdatahash" xmlns:w16sdtfl="http://schemas.microsoft.com/office/word/2024/wordml/sdtformatlock" xmlns:w16se="http://schemas.microsoft.com/office/word/2015/wordml/symex" xmlns:wpg="http://schemas.microsoft.com/office/word/2010/wordprocessingGroup" xmlns:wpi="http://schemas.microsoft.com/office/word/2010/wordprocessingInk" xmlns:wne="http://schemas.microsoft.com/office/word/2006/wordml" xmlns:wps="http://schemas.microsoft.com/office/word/2010/wordprocessingShape" mc:Ignorable="w14 w15 w16se w16cid w16 w16cex w16sdtdh w16sdtfl w16du wp14">
+<w:document xmlns:wpc="http://schemas.microsoft.com/office/word/2010/wordprocessingCanvas" xmlns:cx="http://schemas.microsoft.com/office/drawing/2014/chartex" xmlns:cx1="http://schemas.microsoft.com/office/drawing/2015/9/8/chartex" xmlns:cx2="http://schemas.microsoft.com/office/drawing/2015/10/21/chartex" xmlns:cx3="http://schemas.microsoft.com/office/drawing/2016/5/9/chartex" xmlns:cx4="http://schemas.microsoft.com/office/drawing/2016/5/10/chartex" xmlns:cx5="http://schemas.microsoft.com/office/drawing/2016/5/11/chartex" xmlns:cx6="http://schemas.microsoft.com/office/drawing/2016/5/12/chartex" xmlns:cx7="http://schemas.microsoft.com/office/drawing/2016/5/13/chartex" xmlns:cx8="http://schemas.microsoft.com/office/drawing/2016/5/14/chartex" xmlns:mc="http://schemas.openxmlformats.org/markup-compatibility/2006" xmlns:aink="http://schemas.microsoft.com/office/drawing/2016/ink" xmlns:am3d="http://schemas.microsoft.com/office/drawing/2017/model3d" xmlns:o="urn:schemas-microsoft-com:office:office" xmlns:oel="http://schemas.microsoft.com/office/2019/extlst" xmlns:r="http://schemas.openxmlformats.org/officeDocument/2006/relationships" xmlns:m="http://schemas.openxmlformats.org/officeDocument/2006/math" xmlns:v="urn:schemas-microsoft-com:vml" xmlns:wp14="http://schemas.microsoft.com/office/word/2010/wordprocessingDrawing" xmlns:wp="http://schemas.openxmlformats.org/drawingml/2006/wordprocessingDrawing" xmlns:w10="urn:schemas-microsoft-com:office:word" xmlns:w="http://schemas.openxmlformats.org/wordprocessingml/2006/main" xmlns:w14="http://schemas.microsoft.com/office/word/2010/wordml" xmlns:w15="http://schemas.microsoft.com/office/word/2012/wordml" xmlns:w16cei="http://schemas.microsoft.com/office/word/2026/wordml/cei" xmlns:w16cex="http://schemas.microsoft.com/office/word/2018/wordml/cex" xmlns:w16cid="http://schemas.microsoft.com/office/word/2016/wordml/cid" xmlns:w16="http://schemas.microsoft.com/office/word/2018/wordml" xmlns:w16du="http://schemas.microsoft.com/office/word/2023/wordml/word16du" xmlns:w16sdtdh="http://schemas.microsoft.com/office/word/2020/wordml/sdtdatahash" xmlns:w16sdtfl="http://schemas.microsoft.com/office/word/2024/wordml/sdtformatlock" xmlns:w16se="http://schemas.microsoft.com/office/word/2015/wordml/symex" xmlns:wpg="http://schemas.microsoft.com/office/word/2010/wordprocessingGroup" xmlns:wpi="http://schemas.microsoft.com/office/word/2010/wordprocessingInk" xmlns:wne="http://schemas.microsoft.com/office/word/2006/wordml" xmlns:wps="http://schemas.microsoft.com/office/word/2010/wordprocessingShape" mc:Ignorable="w14 w15 w16se w16cid w16 w16cex w16sdtdh w16sdtfl w16du wp14">
   <w:body>
     <w:p>
       <w:pPr>
@@ -16,17 +16,7 @@
           <w:bCs/>
           <w:u w:val="single"/>
         </w:rPr>
-        <w:t xml:space="preserve">IN THE COURT OF THE </w:t>
-      </w:r>
-      <w:r>
-        <w:rPr>
-          <w:rFonts w:ascii="Tahoma" w:hAnsi="Tahoma" w:cs="Tahoma"/>
-          <w:b/>
-          <w:bCs/>
-          <w:noProof/>
-          <w:u w:val="single"/>
-        </w:rPr>
-        <w:t>court_name</w:t>
+        <w:t>IN THE COURT OF THE {{court_name}}</w:t>
       </w:r>
     </w:p>
     <w:p>
@@ -56,7 +46,7 @@
           <w:noProof/>
           <w:szCs w:val="16"/>
         </w:rPr>
-        <w:t>year</w:t>
+        <w:t>{{year}}</w:t>
       </w:r>
     </w:p>
     <w:p>
@@ -108,7 +98,21 @@
           <w:rFonts w:ascii="Tahoma" w:hAnsi="Tahoma" w:cs="Tahoma"/>
           <w:noProof/>
         </w:rPr>
+        <w:t>{{</w:t>
+      </w:r>
+      <w:r>
+        <w:rPr>
+          <w:rFonts w:ascii="Tahoma" w:hAnsi="Tahoma" w:cs="Tahoma"/>
+          <w:noProof/>
+        </w:rPr>
         <w:t>petitioner</w:t>
+      </w:r>
+      <w:r>
+        <w:rPr>
+          <w:rFonts w:ascii="Tahoma" w:hAnsi="Tahoma" w:cs="Tahoma"/>
+          <w:noProof/>
+        </w:rPr>
+        <w:t>}}</w:t>
       </w:r>
       <w:r>
         <w:rPr>
@@ -173,7 +177,28 @@
           <w:rFonts w:ascii="Tahoma" w:hAnsi="Tahoma" w:cs="Tahoma"/>
           <w:noProof/>
         </w:rPr>
-        <w:t>respondent</w:t>
+        <w:t>{{</w:t>
+      </w:r>
+      <w:r>
+        <w:rPr>
+          <w:rFonts w:ascii="Tahoma" w:hAnsi="Tahoma" w:cs="Tahoma"/>
+          <w:noProof/>
+        </w:rPr>
+        <w:t>R</w:t>
+      </w:r>
+      <w:r>
+        <w:rPr>
+          <w:rFonts w:ascii="Tahoma" w:hAnsi="Tahoma" w:cs="Tahoma"/>
+          <w:noProof/>
+        </w:rPr>
+        <w:t>espondent</w:t>
+      </w:r>
+      <w:r>
+        <w:rPr>
+          <w:rFonts w:ascii="Tahoma" w:hAnsi="Tahoma" w:cs="Tahoma"/>
+          <w:noProof/>
+        </w:rPr>
+        <w:t>}}</w:t>
       </w:r>
     </w:p>
     <w:p>
@@ -230,7 +255,7 @@
           <w:noProof/>
           <w:u w:val="single"/>
         </w:rPr>
-        <w:t>suit_for</w:t>
+        <w:t>{{suit_for}}</w:t>
       </w:r>
     </w:p>
     <w:p>
@@ -303,29 +328,6 @@
       <w:r>
         <w:rPr>
           <w:rFonts w:ascii="Tahoma" w:hAnsi="Tahoma" w:cs="Tahoma"/>
-          <w:noProof/>
-        </w:rPr>
-        <w:t>petitioner</w:t>
-      </w:r>
-    </w:p>
-    <w:p>
-      <w:pPr>
-        <w:jc w:val="both"/>
-        <w:rPr>
-          <w:rFonts w:ascii="Tahoma" w:hAnsi="Tahoma" w:cs="Tahoma"/>
-        </w:rPr>
-      </w:pPr>
-    </w:p>
-    <w:p>
-      <w:pPr>
-        <w:jc w:val="both"/>
-        <w:rPr>
-          <w:rFonts w:ascii="Tahoma" w:hAnsi="Tahoma" w:cs="Tahoma"/>
-        </w:rPr>
-      </w:pPr>
-      <w:r>
-        <w:rPr>
-          <w:rFonts w:ascii="Tahoma" w:hAnsi="Tahoma" w:cs="Tahoma"/>
         </w:rPr>
         <w:t xml:space="preserve">The address of the Plaintiff for the purpose of service of all notices, summons and process etc., is that of their counsel  </w:t>
       </w:r>
@@ -334,7 +336,7 @@
           <w:rFonts w:ascii="Tahoma" w:hAnsi="Tahoma" w:cs="Tahoma"/>
           <w:noProof/>
         </w:rPr>
-        <w:t>address_for_service</w:t>
+        <w:t>{{address_for_service}}</w:t>
       </w:r>
     </w:p>
     <w:p>
@@ -461,14 +463,14 @@
         <w:rPr>
           <w:rFonts w:ascii="Tahoma" w:hAnsi="Tahoma" w:cs="Tahoma"/>
         </w:rPr>
-        <w:t xml:space="preserve">I submit that while so, the respondents and some anti social elements came to the suit house on _____, when I went to our relatives house along with my children. They broke open my house door which fact was informed to me through colony people. Immediately I along with my relatives rushed to </w:t>
+        <w:t xml:space="preserve">I submit that while so, the respondents and some anti social elements came to the suit house on _____, when I went to our relatives house along with my children. They broke open my house door which fact was informed to me through colony people. Immediately I along with my relatives rushed to the suit house and when I questioned respondents they left the suit property </w:t>
       </w:r>
       <w:r>
         <w:rPr>
           <w:rFonts w:ascii="Tahoma" w:hAnsi="Tahoma" w:cs="Tahoma"/>
         </w:rPr>
         <w:lastRenderedPageBreak/>
-        <w:t>the suit house and when I questioned respondents they left the suit property threatening that they would come with larger force and dispossess me from the suit schedule property. Though I orally approached the ________ Police Station. I was advised to approach the civil court seeking relief of injunction.</w:t>
+        <w:t>threatening that they would come with larger force and dispossess me from the suit schedule property. Though I orally approached the ________ Police Station. I was advised to approach the civil court seeking relief of injunction.</w:t>
       </w:r>
     </w:p>
     <w:p>
@@ -600,8 +602,8 @@
         </w:rPr>
         <w:t xml:space="preserve">:  This </w:t>
       </w:r>
-      <w:smartTag w:uri="urn:schemas-microsoft-com:office:smarttags" w:element="address">
-        <w:smartTag w:uri="urn:schemas-microsoft-com:office:smarttags" w:element="Street">
+      <w:smartTag w:uri="urn:schemas-microsoft-com:office:smarttags" w:element="Street">
+        <w:smartTag w:uri="urn:schemas-microsoft-com:office:smarttags" w:element="address">
           <w:r>
             <w:rPr>
               <w:rFonts w:ascii="Tahoma" w:hAnsi="Tahoma" w:cs="Tahoma"/>
@@ -616,8 +618,8 @@
         </w:rPr>
         <w:t xml:space="preserve"> has jurisdiction to try the suit, the suit scheduled lands are situated at __________ District and the Defendant also reside the Jurisdiction of this </w:t>
       </w:r>
-      <w:smartTag w:uri="urn:schemas-microsoft-com:office:smarttags" w:element="address">
-        <w:smartTag w:uri="urn:schemas-microsoft-com:office:smarttags" w:element="Street">
+      <w:smartTag w:uri="urn:schemas-microsoft-com:office:smarttags" w:element="Street">
+        <w:smartTag w:uri="urn:schemas-microsoft-com:office:smarttags" w:element="address">
           <w:r>
             <w:rPr>
               <w:rFonts w:ascii="Tahoma" w:hAnsi="Tahoma" w:cs="Tahoma"/>
@@ -656,7 +658,6 @@
           <w:b/>
           <w:u w:val="single"/>
         </w:rPr>
-        <w:lastRenderedPageBreak/>
         <w:t>LIMITATION</w:t>
       </w:r>
       <w:r>
@@ -670,7 +671,7 @@
           <w:rFonts w:ascii="Tahoma" w:hAnsi="Tahoma" w:cs="Tahoma"/>
           <w:noProof/>
         </w:rPr>
-        <w:t>suit_for</w:t>
+        <w:t>{{suit_for}}</w:t>
       </w:r>
       <w:r>
         <w:rPr>
@@ -702,6 +703,7 @@
           <w:b/>
           <w:u w:val="single"/>
         </w:rPr>
+        <w:lastRenderedPageBreak/>
         <w:t>DECLARATION</w:t>
       </w:r>
       <w:r>
@@ -793,8 +795,8 @@
         </w:rPr>
         <w:t xml:space="preserve">Therefore, it is prayed that this </w:t>
       </w:r>
-      <w:smartTag w:uri="urn:schemas-microsoft-com:office:smarttags" w:element="address">
-        <w:smartTag w:uri="urn:schemas-microsoft-com:office:smarttags" w:element="Street">
+      <w:smartTag w:uri="urn:schemas-microsoft-com:office:smarttags" w:element="Street">
+        <w:smartTag w:uri="urn:schemas-microsoft-com:office:smarttags" w:element="address">
           <w:r>
             <w:rPr>
               <w:rFonts w:ascii="Tahoma" w:hAnsi="Tahoma" w:cs="Tahoma"/>
@@ -884,8 +886,8 @@
         </w:rPr>
         <w:t xml:space="preserve">d) Granting such other relief or relieves as this </w:t>
       </w:r>
-      <w:smartTag w:uri="urn:schemas-microsoft-com:office:smarttags" w:element="address">
-        <w:smartTag w:uri="urn:schemas-microsoft-com:office:smarttags" w:element="Street">
+      <w:smartTag w:uri="urn:schemas-microsoft-com:office:smarttags" w:element="Street">
+        <w:smartTag w:uri="urn:schemas-microsoft-com:office:smarttags" w:element="address">
           <w:r>
             <w:rPr>
               <w:rFonts w:ascii="Tahoma" w:hAnsi="Tahoma" w:cs="Tahoma"/>
@@ -936,16 +938,30 @@
           <w:rFonts w:ascii="Tahoma" w:hAnsi="Tahoma" w:cs="Tahoma"/>
           <w:noProof/>
         </w:rPr>
-        <w:t>dof</w:t>
-      </w:r>
-    </w:p>
-    <w:p>
-      <w:pPr>
-        <w:jc w:val="both"/>
-        <w:rPr>
-          <w:rFonts w:ascii="Tahoma" w:hAnsi="Tahoma" w:cs="Tahoma"/>
-        </w:rPr>
-      </w:pPr>
+        <w:t>{{dof}}</w:t>
+      </w:r>
+    </w:p>
+    <w:p>
+      <w:pPr>
+        <w:jc w:val="both"/>
+        <w:rPr>
+          <w:rFonts w:ascii="Tahoma" w:hAnsi="Tahoma" w:cs="Tahoma"/>
+        </w:rPr>
+      </w:pPr>
+      <w:r>
+        <w:rPr>
+          <w:rFonts w:ascii="Tahoma" w:hAnsi="Tahoma" w:cs="Tahoma"/>
+          <w:noProof/>
+        </w:rPr>
+        <w:t>Place:</w:t>
+      </w:r>
+      <w:r>
+        <w:rPr>
+          <w:rFonts w:ascii="Tahoma" w:hAnsi="Tahoma" w:cs="Tahoma"/>
+          <w:noProof/>
+        </w:rPr>
+        <w:t>{{</w:t>
+      </w:r>
       <w:r>
         <w:rPr>
           <w:rFonts w:ascii="Tahoma" w:hAnsi="Tahoma" w:cs="Tahoma"/>
@@ -957,7 +973,13 @@
         <w:rPr>
           <w:rFonts w:ascii="Tahoma" w:hAnsi="Tahoma" w:cs="Tahoma"/>
         </w:rPr>
-        <w:t xml:space="preserve">                                                                  PLAINTIFF</w:t>
+        <w:t>}}</w:t>
+      </w:r>
+      <w:r>
+        <w:rPr>
+          <w:rFonts w:ascii="Tahoma" w:hAnsi="Tahoma" w:cs="Tahoma"/>
+        </w:rPr>
+        <w:t xml:space="preserve">                                                                 PLAINTIFF</w:t>
       </w:r>
     </w:p>
     <w:p>
@@ -1016,52 +1038,58 @@
           <w:rFonts w:ascii="Tahoma" w:hAnsi="Tahoma" w:cs="Tahoma"/>
           <w:szCs w:val="24"/>
         </w:rPr>
+        <w:t>VERIFICATION</w:t>
+      </w:r>
+    </w:p>
+    <w:p>
+      <w:pPr>
+        <w:spacing w:line="360" w:lineRule="auto"/>
+        <w:jc w:val="both"/>
+        <w:rPr>
+          <w:rFonts w:ascii="Tahoma" w:hAnsi="Tahoma" w:cs="Tahoma"/>
+        </w:rPr>
+      </w:pPr>
+    </w:p>
+    <w:p>
+      <w:pPr>
+        <w:spacing w:line="360" w:lineRule="auto"/>
+        <w:jc w:val="both"/>
+        <w:rPr>
+          <w:rFonts w:ascii="Tahoma" w:hAnsi="Tahoma" w:cs="Tahoma"/>
+        </w:rPr>
+      </w:pPr>
+      <w:r>
+        <w:rPr>
+          <w:rFonts w:ascii="Tahoma" w:hAnsi="Tahoma" w:cs="Tahoma"/>
+        </w:rPr>
+        <w:t xml:space="preserve">     I, </w:t>
+      </w:r>
+      <w:r>
+        <w:rPr>
+          <w:rFonts w:ascii="Tahoma" w:hAnsi="Tahoma" w:cs="Tahoma"/>
+          <w:noProof/>
+        </w:rPr>
+        <w:t>{{aff_oath}}</w:t>
+      </w:r>
+      <w:r>
+        <w:rPr>
+          <w:rFonts w:ascii="Tahoma" w:hAnsi="Tahoma" w:cs="Tahoma"/>
+        </w:rPr>
+        <w:t xml:space="preserve">, herein do hereby declare that the contents of the Plaint No.1 to __ are true and correct to the best of my knowledge, belief and </w:t>
+      </w:r>
+      <w:r>
+        <w:rPr>
+          <w:rFonts w:ascii="Tahoma" w:hAnsi="Tahoma" w:cs="Tahoma"/>
+        </w:rPr>
         <w:lastRenderedPageBreak/>
-        <w:t>VERIFICATION</w:t>
-      </w:r>
-    </w:p>
-    <w:p>
-      <w:pPr>
-        <w:spacing w:line="360" w:lineRule="auto"/>
-        <w:jc w:val="both"/>
-        <w:rPr>
-          <w:rFonts w:ascii="Tahoma" w:hAnsi="Tahoma" w:cs="Tahoma"/>
-        </w:rPr>
-      </w:pPr>
-    </w:p>
-    <w:p>
-      <w:pPr>
-        <w:spacing w:line="360" w:lineRule="auto"/>
-        <w:jc w:val="both"/>
-        <w:rPr>
-          <w:rFonts w:ascii="Tahoma" w:hAnsi="Tahoma" w:cs="Tahoma"/>
-        </w:rPr>
-      </w:pPr>
-      <w:r>
-        <w:rPr>
-          <w:rFonts w:ascii="Tahoma" w:hAnsi="Tahoma" w:cs="Tahoma"/>
-        </w:rPr>
-        <w:t xml:space="preserve">     I, </w:t>
-      </w:r>
-      <w:r>
-        <w:rPr>
-          <w:rFonts w:ascii="Tahoma" w:hAnsi="Tahoma" w:cs="Tahoma"/>
-          <w:noProof/>
-        </w:rPr>
-        <w:t>aff_oath</w:t>
-      </w:r>
-      <w:r>
-        <w:rPr>
-          <w:rFonts w:ascii="Tahoma" w:hAnsi="Tahoma" w:cs="Tahoma"/>
-        </w:rPr>
-        <w:t xml:space="preserve">, herein do hereby declare that the contents of the Plaint No.1 to __ are true and correct to the best of my knowledge, belief and information and as per legal advise received. Hence verified on </w:t>
-      </w:r>
-      <w:r>
-        <w:rPr>
-          <w:rFonts w:ascii="Tahoma" w:hAnsi="Tahoma" w:cs="Tahoma"/>
-          <w:noProof/>
-        </w:rPr>
-        <w:t>dof</w:t>
+        <w:t xml:space="preserve">information and as per legal advise received. Hence verified on </w:t>
+      </w:r>
+      <w:r>
+        <w:rPr>
+          <w:rFonts w:ascii="Tahoma" w:hAnsi="Tahoma" w:cs="Tahoma"/>
+          <w:noProof/>
+        </w:rPr>
+        <w:t>{{dof}}</w:t>
       </w:r>
       <w:r>
         <w:rPr>
@@ -1109,28 +1137,35 @@
           <w:rFonts w:ascii="Tahoma" w:hAnsi="Tahoma" w:cs="Tahoma"/>
           <w:noProof/>
         </w:rPr>
-        <w:t>dof</w:t>
-      </w:r>
-    </w:p>
-    <w:p>
-      <w:pPr>
-        <w:jc w:val="both"/>
-        <w:rPr>
-          <w:rFonts w:ascii="Tahoma" w:hAnsi="Tahoma" w:cs="Tahoma"/>
-        </w:rPr>
-      </w:pPr>
-      <w:r>
-        <w:rPr>
-          <w:rFonts w:ascii="Tahoma" w:hAnsi="Tahoma" w:cs="Tahoma"/>
-          <w:noProof/>
-        </w:rPr>
-        <w:t>place</w:t>
-      </w:r>
-      <w:r>
-        <w:rPr>
-          <w:rFonts w:ascii="Tahoma" w:hAnsi="Tahoma" w:cs="Tahoma"/>
-        </w:rPr>
-        <w:t xml:space="preserve">                                                                   PLAINTIFF</w:t>
+        <w:t>{{dof}}</w:t>
+      </w:r>
+    </w:p>
+    <w:p>
+      <w:pPr>
+        <w:jc w:val="both"/>
+        <w:rPr>
+          <w:rFonts w:ascii="Tahoma" w:hAnsi="Tahoma" w:cs="Tahoma"/>
+        </w:rPr>
+      </w:pPr>
+      <w:r>
+        <w:rPr>
+          <w:rFonts w:ascii="Tahoma" w:hAnsi="Tahoma" w:cs="Tahoma"/>
+          <w:noProof/>
+        </w:rPr>
+        <w:t>Place:</w:t>
+      </w:r>
+      <w:r>
+        <w:rPr>
+          <w:rFonts w:ascii="Tahoma" w:hAnsi="Tahoma" w:cs="Tahoma"/>
+          <w:noProof/>
+        </w:rPr>
+        <w:t>{{place}}</w:t>
+      </w:r>
+      <w:r>
+        <w:rPr>
+          <w:rFonts w:ascii="Tahoma" w:hAnsi="Tahoma" w:cs="Tahoma"/>
+        </w:rPr>
+        <w:t xml:space="preserve">                                                               PLAINTIFF</w:t>
       </w:r>
     </w:p>
     <w:p>
@@ -1298,16 +1333,30 @@
           <w:rFonts w:ascii="Tahoma" w:hAnsi="Tahoma" w:cs="Tahoma"/>
           <w:noProof/>
         </w:rPr>
-        <w:t>dof</w:t>
-      </w:r>
-    </w:p>
-    <w:p>
-      <w:pPr>
-        <w:jc w:val="both"/>
-        <w:rPr>
-          <w:rFonts w:ascii="Tahoma" w:hAnsi="Tahoma" w:cs="Tahoma"/>
-        </w:rPr>
-      </w:pPr>
+        <w:t>{{dof}}</w:t>
+      </w:r>
+    </w:p>
+    <w:p>
+      <w:pPr>
+        <w:jc w:val="both"/>
+        <w:rPr>
+          <w:rFonts w:ascii="Tahoma" w:hAnsi="Tahoma" w:cs="Tahoma"/>
+        </w:rPr>
+      </w:pPr>
+      <w:r>
+        <w:rPr>
+          <w:rFonts w:ascii="Tahoma" w:hAnsi="Tahoma" w:cs="Tahoma"/>
+          <w:noProof/>
+        </w:rPr>
+        <w:t>Place:</w:t>
+      </w:r>
+      <w:r>
+        <w:rPr>
+          <w:rFonts w:ascii="Tahoma" w:hAnsi="Tahoma" w:cs="Tahoma"/>
+          <w:noProof/>
+        </w:rPr>
+        <w:t>{{</w:t>
+      </w:r>
       <w:r>
         <w:rPr>
           <w:rFonts w:ascii="Tahoma" w:hAnsi="Tahoma" w:cs="Tahoma"/>
@@ -1320,6 +1369,12 @@
           <w:rFonts w:ascii="Tahoma" w:hAnsi="Tahoma" w:cs="Tahoma"/>
         </w:rPr>
         <w:tab/>
+      </w:r>
+      <w:r>
+        <w:rPr>
+          <w:rFonts w:ascii="Tahoma" w:hAnsi="Tahoma" w:cs="Tahoma"/>
+        </w:rPr>
+        <w:t>}}</w:t>
       </w:r>
       <w:r>
         <w:rPr>
@@ -1423,7 +1478,7 @@
           <w:rFonts w:ascii="Tahoma" w:hAnsi="Tahoma" w:cs="Tahoma"/>
           <w:noProof/>
         </w:rPr>
-        <w:t>aff_oath</w:t>
+        <w:t>{{aff_oath}}</w:t>
       </w:r>
       <w:r>
         <w:rPr>
@@ -1449,7 +1504,7 @@
           <w:rFonts w:ascii="Tahoma" w:hAnsi="Tahoma" w:cs="Tahoma"/>
           <w:noProof/>
         </w:rPr>
-        <w:t>dof</w:t>
+        <w:t>{{dof}}</w:t>
       </w:r>
     </w:p>
     <w:p>
@@ -1479,22 +1534,43 @@
           <w:rFonts w:ascii="Tahoma" w:hAnsi="Tahoma" w:cs="Tahoma"/>
           <w:noProof/>
         </w:rPr>
-        <w:t>dof</w:t>
-      </w:r>
-    </w:p>
-    <w:p>
-      <w:pPr>
-        <w:jc w:val="both"/>
-        <w:rPr>
-          <w:rFonts w:ascii="Tahoma" w:hAnsi="Tahoma" w:cs="Tahoma"/>
-        </w:rPr>
-      </w:pPr>
+        <w:t>{{dof}}</w:t>
+      </w:r>
+    </w:p>
+    <w:p>
+      <w:pPr>
+        <w:jc w:val="both"/>
+        <w:rPr>
+          <w:rFonts w:ascii="Tahoma" w:hAnsi="Tahoma" w:cs="Tahoma"/>
+        </w:rPr>
+      </w:pPr>
+      <w:r>
+        <w:rPr>
+          <w:rFonts w:ascii="Tahoma" w:hAnsi="Tahoma" w:cs="Tahoma"/>
+          <w:noProof/>
+        </w:rPr>
+        <w:t xml:space="preserve">Place: </w:t>
+      </w:r>
+      <w:r>
+        <w:rPr>
+          <w:rFonts w:ascii="Tahoma" w:hAnsi="Tahoma" w:cs="Tahoma"/>
+          <w:noProof/>
+        </w:rPr>
+        <w:t>{{</w:t>
+      </w:r>
       <w:r>
         <w:rPr>
           <w:rFonts w:ascii="Tahoma" w:hAnsi="Tahoma" w:cs="Tahoma"/>
           <w:noProof/>
         </w:rPr>
         <w:t>place</w:t>
+      </w:r>
+      <w:r>
+        <w:rPr>
+          <w:rFonts w:ascii="Tahoma" w:hAnsi="Tahoma" w:cs="Tahoma"/>
+          <w:noProof/>
+        </w:rPr>
+        <w:t>}}</w:t>
       </w:r>
       <w:r>
         <w:rPr>
@@ -1535,7 +1611,6 @@
           <w:b/>
           <w:u w:val="single"/>
         </w:rPr>
-        <w:lastRenderedPageBreak/>
         <w:t>LIST OF DOCUMENTS</w:t>
       </w:r>
     </w:p>
@@ -1609,7 +1684,17 @@
                 <w:sz w:val="22"/>
                 <w:szCs w:val="22"/>
               </w:rPr>
-              <w:t>Date if any of documents vernacular in English</w:t>
+              <w:t xml:space="preserve">Date if any of documents vernacular in </w:t>
+            </w:r>
+            <w:r>
+              <w:rPr>
+                <w:rFonts w:ascii="Tahoma" w:hAnsi="Tahoma" w:cs="Tahoma"/>
+                <w:b/>
+                <w:sz w:val="22"/>
+                <w:szCs w:val="22"/>
+              </w:rPr>
+              <w:lastRenderedPageBreak/>
+              <w:t>English</w:t>
             </w:r>
           </w:p>
         </w:tc>
@@ -1635,6 +1720,7 @@
                 <w:sz w:val="22"/>
                 <w:szCs w:val="22"/>
               </w:rPr>
+              <w:lastRenderedPageBreak/>
               <w:t>Parties to the Document</w:t>
             </w:r>
           </w:p>
@@ -2014,28 +2100,35 @@
           <w:rFonts w:ascii="Tahoma" w:hAnsi="Tahoma" w:cs="Tahoma"/>
           <w:noProof/>
         </w:rPr>
-        <w:t>dof</w:t>
-      </w:r>
-    </w:p>
-    <w:p>
-      <w:pPr>
-        <w:jc w:val="both"/>
-        <w:rPr>
-          <w:rFonts w:ascii="Tahoma" w:hAnsi="Tahoma" w:cs="Tahoma"/>
-        </w:rPr>
-      </w:pPr>
-      <w:r>
-        <w:rPr>
-          <w:rFonts w:ascii="Tahoma" w:hAnsi="Tahoma" w:cs="Tahoma"/>
-          <w:noProof/>
-        </w:rPr>
-        <w:t>place</w:t>
-      </w:r>
-      <w:r>
-        <w:rPr>
-          <w:rFonts w:ascii="Tahoma" w:hAnsi="Tahoma" w:cs="Tahoma"/>
-        </w:rPr>
-        <w:t xml:space="preserve">                                                                   PLAINTIFF</w:t>
+        <w:t>{{dof}}</w:t>
+      </w:r>
+    </w:p>
+    <w:p>
+      <w:pPr>
+        <w:jc w:val="both"/>
+        <w:rPr>
+          <w:rFonts w:ascii="Tahoma" w:hAnsi="Tahoma" w:cs="Tahoma"/>
+        </w:rPr>
+      </w:pPr>
+      <w:r>
+        <w:rPr>
+          <w:rFonts w:ascii="Tahoma" w:hAnsi="Tahoma" w:cs="Tahoma"/>
+          <w:noProof/>
+        </w:rPr>
+        <w:t xml:space="preserve">Place: </w:t>
+      </w:r>
+      <w:r>
+        <w:rPr>
+          <w:rFonts w:ascii="Tahoma" w:hAnsi="Tahoma" w:cs="Tahoma"/>
+          <w:noProof/>
+        </w:rPr>
+        <w:t>{{place}}</w:t>
+      </w:r>
+      <w:r>
+        <w:rPr>
+          <w:rFonts w:ascii="Tahoma" w:hAnsi="Tahoma" w:cs="Tahoma"/>
+        </w:rPr>
+        <w:t xml:space="preserve">                                                               PLAINTIFF</w:t>
       </w:r>
     </w:p>
     <w:p>
@@ -2060,16 +2153,7 @@
           <w:u w:val="single"/>
         </w:rPr>
         <w:lastRenderedPageBreak/>
-        <w:t xml:space="preserve">IN THE COURT OF THE </w:t>
-      </w:r>
-      <w:r>
-        <w:rPr>
-          <w:rFonts w:ascii="Tahoma" w:hAnsi="Tahoma" w:cs="Tahoma"/>
-          <w:b/>
-          <w:noProof/>
-          <w:u w:val="single"/>
-        </w:rPr>
-        <w:t>court_name</w:t>
+        <w:t>IN THE COURT OF THE {{court_name}}</w:t>
       </w:r>
     </w:p>
     <w:p>
@@ -2109,7 +2193,7 @@
           <w:noProof/>
           <w:szCs w:val="16"/>
         </w:rPr>
-        <w:t>year</w:t>
+        <w:t>{{year}}</w:t>
       </w:r>
     </w:p>
     <w:p>
@@ -2162,7 +2246,7 @@
           <w:rFonts w:ascii="Tahoma" w:hAnsi="Tahoma" w:cs="Tahoma"/>
           <w:noProof/>
         </w:rPr>
-        <w:t>pet_name</w:t>
+        <w:t>{{pet_name}}</w:t>
       </w:r>
     </w:p>
     <w:p>
@@ -2213,7 +2297,7 @@
           <w:rFonts w:ascii="Tahoma" w:hAnsi="Tahoma" w:cs="Tahoma"/>
           <w:noProof/>
         </w:rPr>
-        <w:t>res_name</w:t>
+        <w:t>{{res_name}}</w:t>
       </w:r>
     </w:p>
     <w:p>
@@ -2404,7 +2488,7 @@
           <w:rFonts w:ascii="Tahoma" w:hAnsi="Tahoma" w:cs="Tahoma"/>
           <w:noProof/>
         </w:rPr>
-        <w:t>dof</w:t>
+        <w:t>{{dof}}</w:t>
       </w:r>
       <w:r>
         <w:rPr>
@@ -2464,14 +2548,38 @@
         <w:rPr>
           <w:rFonts w:ascii="Tahoma" w:hAnsi="Tahoma" w:cs="Tahoma"/>
         </w:rPr>
-        <w:t xml:space="preserve">I, do hereby declare that what is stated in the above schedule is true and correct to the best of my knowledge and belief and signed on this </w:t>
-      </w:r>
-      <w:r>
-        <w:rPr>
-          <w:rFonts w:ascii="Tahoma" w:hAnsi="Tahoma" w:cs="Tahoma"/>
-          <w:noProof/>
-        </w:rPr>
-        <w:t>dof</w:t>
+        <w:t>I,</w:t>
+      </w:r>
+      <w:r>
+        <w:rPr>
+          <w:rFonts w:ascii="Tahoma" w:hAnsi="Tahoma" w:cs="Tahoma"/>
+        </w:rPr>
+        <w:t>{{</w:t>
+      </w:r>
+      <w:r>
+        <w:rPr>
+          <w:rFonts w:ascii="Tahoma" w:hAnsi="Tahoma" w:cs="Tahoma"/>
+        </w:rPr>
+        <w:t>aff_oath</w:t>
+      </w:r>
+      <w:r>
+        <w:rPr>
+          <w:rFonts w:ascii="Tahoma" w:hAnsi="Tahoma" w:cs="Tahoma"/>
+        </w:rPr>
+        <w:t>}}</w:t>
+      </w:r>
+      <w:r>
+        <w:rPr>
+          <w:rFonts w:ascii="Tahoma" w:hAnsi="Tahoma" w:cs="Tahoma"/>
+        </w:rPr>
+        <w:t xml:space="preserve"> do hereby declare that what is stated in the above schedule is true and correct to the best of my knowledge and belief and signed on this </w:t>
+      </w:r>
+      <w:r>
+        <w:rPr>
+          <w:rFonts w:ascii="Tahoma" w:hAnsi="Tahoma" w:cs="Tahoma"/>
+          <w:noProof/>
+        </w:rPr>
+        <w:t>{{dof}}</w:t>
       </w:r>
       <w:r>
         <w:rPr>
@@ -2578,7 +2686,7 @@
           <w:rFonts w:ascii="Tahoma" w:hAnsi="Tahoma" w:cs="Tahoma"/>
           <w:noProof/>
         </w:rPr>
-        <w:t>adv_name</w:t>
+        <w:t>{{adv_name}}</w:t>
       </w:r>
     </w:p>
     <w:p>
@@ -2643,8 +2751,24 @@
           <w:noProof/>
           <w:u w:val="single"/>
         </w:rPr>
+        <w:t>{{</w:t>
+      </w:r>
+      <w:r>
+        <w:rPr>
+          <w:rFonts w:ascii="Tahoma" w:hAnsi="Tahoma" w:cs="Tahoma"/>
+          <w:noProof/>
+          <w:u w:val="single"/>
+        </w:rPr>
         <w:t>court_name</w:t>
       </w:r>
+      <w:r>
+        <w:rPr>
+          <w:rFonts w:ascii="Tahoma" w:hAnsi="Tahoma" w:cs="Tahoma"/>
+          <w:noProof/>
+          <w:u w:val="single"/>
+        </w:rPr>
+        <w:t>}}</w:t>
+      </w:r>
     </w:p>
     <w:p>
       <w:pPr>
@@ -2684,7 +2808,7 @@
           <w:noProof/>
           <w:szCs w:val="16"/>
         </w:rPr>
-        <w:t>year</w:t>
+        <w:t>{{year}}</w:t>
       </w:r>
     </w:p>
     <w:p>
@@ -2741,7 +2865,7 @@
           <w:rFonts w:ascii="Tahoma" w:hAnsi="Tahoma" w:cs="Tahoma"/>
           <w:noProof/>
         </w:rPr>
-        <w:t>pet_name</w:t>
+        <w:t>{{pet_name}}</w:t>
       </w:r>
     </w:p>
     <w:p>
@@ -2812,7 +2936,7 @@
           <w:rFonts w:ascii="Tahoma" w:hAnsi="Tahoma" w:cs="Tahoma"/>
           <w:noProof/>
         </w:rPr>
-        <w:t>res_name</w:t>
+        <w:t>{{res_name}}</w:t>
       </w:r>
     </w:p>
     <w:p>
@@ -2900,7 +3024,7 @@
           <w:noProof/>
           <w:u w:val="single"/>
         </w:rPr>
-        <w:t>suit_for</w:t>
+        <w:t>{{suit_for}}</w:t>
       </w:r>
     </w:p>
     <w:p>
@@ -2994,7 +3118,7 @@
           <w:rFonts w:ascii="Tahoma" w:hAnsi="Tahoma" w:cs="Tahoma"/>
           <w:noProof/>
         </w:rPr>
-        <w:t>dof</w:t>
+        <w:t>{{dof}}</w:t>
       </w:r>
     </w:p>
     <w:p>
@@ -3064,7 +3188,7 @@
           <w:rFonts w:ascii="Tahoma" w:hAnsi="Tahoma" w:cs="Tahoma"/>
           <w:noProof/>
         </w:rPr>
-        <w:t>address_for_service</w:t>
+        <w:t>{{address_for_service}}</w:t>
       </w:r>
     </w:p>
     <w:p>
@@ -3114,16 +3238,7 @@
           <w:u w:val="single"/>
         </w:rPr>
         <w:lastRenderedPageBreak/>
-        <w:t xml:space="preserve">IN THE COURT OF THE </w:t>
-      </w:r>
-      <w:r>
-        <w:rPr>
-          <w:rFonts w:ascii="Tahoma" w:hAnsi="Tahoma" w:cs="Tahoma"/>
-          <w:b/>
-          <w:noProof/>
-          <w:u w:val="single"/>
-        </w:rPr>
-        <w:t>court_name</w:t>
+        <w:t>IN THE COURT OF THE {{court_name}}</w:t>
       </w:r>
     </w:p>
     <w:p>
@@ -3163,7 +3278,7 @@
           <w:noProof/>
           <w:szCs w:val="16"/>
         </w:rPr>
-        <w:t>year</w:t>
+        <w:t>{{year}}</w:t>
       </w:r>
     </w:p>
     <w:p>
@@ -3216,7 +3331,7 @@
           <w:rFonts w:ascii="Tahoma" w:hAnsi="Tahoma" w:cs="Tahoma"/>
           <w:noProof/>
         </w:rPr>
-        <w:t>pet_name</w:t>
+        <w:t>{{pet_name}}</w:t>
       </w:r>
     </w:p>
     <w:p>
@@ -3267,7 +3382,7 @@
           <w:rFonts w:ascii="Tahoma" w:hAnsi="Tahoma" w:cs="Tahoma"/>
           <w:noProof/>
         </w:rPr>
-        <w:t>res_name</w:t>
+        <w:t>{{res_name}}</w:t>
       </w:r>
     </w:p>
     <w:p>
@@ -3354,7 +3469,7 @@
           <w:rFonts w:ascii="Tahoma" w:hAnsi="Tahoma" w:cs="Tahoma"/>
           <w:noProof/>
         </w:rPr>
-        <w:t>aff_oath</w:t>
+        <w:t>{{aff_oath}}</w:t>
       </w:r>
       <w:r>
         <w:rPr>
@@ -3434,8 +3549,8 @@
         </w:rPr>
         <w:t xml:space="preserve">     Hence, it is prayed that this </w:t>
       </w:r>
-      <w:smartTag w:uri="urn:schemas-microsoft-com:office:smarttags" w:element="address">
-        <w:smartTag w:uri="urn:schemas-microsoft-com:office:smarttags" w:element="Street">
+      <w:smartTag w:uri="urn:schemas-microsoft-com:office:smarttags" w:element="Street">
+        <w:smartTag w:uri="urn:schemas-microsoft-com:office:smarttags" w:element="address">
           <w:r>
             <w:rPr>
               <w:rFonts w:ascii="Tahoma" w:hAnsi="Tahoma" w:cs="Tahoma"/>
@@ -3450,8 +3565,8 @@
         </w:rPr>
         <w:t xml:space="preserve"> may be pleased to pass a decree and judgment in my favour and against the defendants and such other reliefs as this </w:t>
       </w:r>
-      <w:smartTag w:uri="urn:schemas-microsoft-com:office:smarttags" w:element="address">
-        <w:smartTag w:uri="urn:schemas-microsoft-com:office:smarttags" w:element="Street">
+      <w:smartTag w:uri="urn:schemas-microsoft-com:office:smarttags" w:element="Street">
+        <w:smartTag w:uri="urn:schemas-microsoft-com:office:smarttags" w:element="address">
           <w:r>
             <w:rPr>
               <w:rFonts w:ascii="Tahoma" w:hAnsi="Tahoma" w:cs="Tahoma"/>
@@ -3562,7 +3677,7 @@
           <w:rFonts w:ascii="Tahoma" w:hAnsi="Tahoma" w:cs="Tahoma"/>
           <w:noProof/>
         </w:rPr>
-        <w:t>dof</w:t>
+        <w:t>{{dof}}</w:t>
       </w:r>
     </w:p>
     <w:p>
@@ -3633,9 +3748,22 @@
       <w:r>
         <w:rPr>
           <w:rFonts w:ascii="Tahoma" w:hAnsi="Tahoma" w:cs="Tahoma"/>
+        </w:rPr>
+        <w:t>{{</w:t>
+      </w:r>
+      <w:r>
+        <w:rPr>
+          <w:rFonts w:ascii="Tahoma" w:hAnsi="Tahoma" w:cs="Tahoma"/>
           <w:noProof/>
         </w:rPr>
         <w:t>place</w:t>
+      </w:r>
+      <w:r>
+        <w:rPr>
+          <w:rFonts w:ascii="Tahoma" w:hAnsi="Tahoma" w:cs="Tahoma"/>
+          <w:noProof/>
+        </w:rPr>
+        <w:t>}}</w:t>
       </w:r>
     </w:p>
     <w:p>
@@ -3678,17 +3806,33 @@
           <w:noProof/>
           <w:u w:val="single"/>
         </w:rPr>
+        <w:t>{{</w:t>
+      </w:r>
+      <w:r>
+        <w:rPr>
+          <w:rFonts w:ascii="Tahoma" w:hAnsi="Tahoma" w:cs="Tahoma"/>
+          <w:noProof/>
+          <w:u w:val="single"/>
+        </w:rPr>
         <w:t>court_name</w:t>
       </w:r>
-    </w:p>
-    <w:p>
-      <w:pPr>
-        <w:ind w:left="5040" w:right="-720"/>
-        <w:jc w:val="center"/>
-        <w:rPr>
-          <w:rFonts w:ascii="Tahoma" w:hAnsi="Tahoma" w:cs="Tahoma"/>
+      <w:r>
+        <w:rPr>
+          <w:rFonts w:ascii="Tahoma" w:hAnsi="Tahoma" w:cs="Tahoma"/>
+          <w:noProof/>
           <w:u w:val="single"/>
         </w:rPr>
+        <w:t>}}</w:t>
+      </w:r>
+    </w:p>
+    <w:p>
+      <w:pPr>
+        <w:ind w:left="5040" w:right="-720"/>
+        <w:jc w:val="center"/>
+        <w:rPr>
+          <w:rFonts w:ascii="Tahoma" w:hAnsi="Tahoma" w:cs="Tahoma"/>
+          <w:u w:val="single"/>
+        </w:rPr>
       </w:pPr>
     </w:p>
     <w:p>
@@ -3720,7 +3864,7 @@
           <w:noProof/>
           <w:szCs w:val="16"/>
         </w:rPr>
-        <w:t>year</w:t>
+        <w:t>{{year}}</w:t>
       </w:r>
     </w:p>
     <w:p>
@@ -3776,7 +3920,7 @@
           <w:rFonts w:ascii="Tahoma" w:hAnsi="Tahoma" w:cs="Tahoma"/>
           <w:noProof/>
         </w:rPr>
-        <w:t>pet_name</w:t>
+        <w:t>{{pet_name}}</w:t>
       </w:r>
     </w:p>
     <w:p>
@@ -3840,7 +3984,7 @@
           <w:rFonts w:ascii="Tahoma" w:hAnsi="Tahoma" w:cs="Tahoma"/>
           <w:noProof/>
         </w:rPr>
-        <w:t>res_name</w:t>
+        <w:t>{{res_name}}</w:t>
       </w:r>
     </w:p>
     <w:p>
@@ -4012,7 +4156,7 @@
           <w:rFonts w:ascii="Tahoma" w:hAnsi="Tahoma" w:cs="Tahoma"/>
           <w:noProof/>
         </w:rPr>
-        <w:t>dof</w:t>
+        <w:t>{{dof}}</w:t>
       </w:r>
     </w:p>
     <w:p>
@@ -4056,7 +4200,7 @@
           <w:rFonts w:ascii="Tahoma" w:hAnsi="Tahoma" w:cs="Tahoma"/>
           <w:noProof/>
         </w:rPr>
-        <w:t>address_for_service</w:t>
+        <w:t>{{address_for_service}}</w:t>
       </w:r>
     </w:p>
     <w:p>
@@ -4113,16 +4257,7 @@
           <w:u w:val="single"/>
         </w:rPr>
         <w:lastRenderedPageBreak/>
-        <w:t xml:space="preserve">IN THE COURT OF THE </w:t>
-      </w:r>
-      <w:r>
-        <w:rPr>
-          <w:rFonts w:ascii="Tahoma" w:hAnsi="Tahoma" w:cs="Tahoma"/>
-          <w:b/>
-          <w:noProof/>
-          <w:u w:val="single"/>
-        </w:rPr>
-        <w:t>court_name</w:t>
+        <w:t>IN THE COURT OF THE {{court_name}}</w:t>
       </w:r>
     </w:p>
     <w:p>
@@ -4162,7 +4297,7 @@
           <w:noProof/>
           <w:szCs w:val="16"/>
         </w:rPr>
-        <w:t>year</w:t>
+        <w:t>{{year}}</w:t>
       </w:r>
     </w:p>
     <w:p>
@@ -4215,7 +4350,7 @@
           <w:rFonts w:ascii="Tahoma" w:hAnsi="Tahoma" w:cs="Tahoma"/>
           <w:noProof/>
         </w:rPr>
-        <w:t>pet_name</w:t>
+        <w:t>{{pet_name}}</w:t>
       </w:r>
     </w:p>
     <w:p>
@@ -4266,7 +4401,7 @@
           <w:rFonts w:ascii="Tahoma" w:hAnsi="Tahoma" w:cs="Tahoma"/>
           <w:noProof/>
         </w:rPr>
-        <w:t>res_name</w:t>
+        <w:t>{{res_name}}</w:t>
       </w:r>
     </w:p>
     <w:p>
@@ -4352,7 +4487,7 @@
           <w:rFonts w:ascii="Tahoma" w:hAnsi="Tahoma" w:cs="Tahoma"/>
           <w:noProof/>
         </w:rPr>
-        <w:t>aff_oath</w:t>
+        <w:t>{{aff_oath}}</w:t>
       </w:r>
       <w:r>
         <w:rPr>
@@ -4418,7 +4553,7 @@
           <w:noProof/>
           <w:szCs w:val="24"/>
         </w:rPr>
-        <w:t>suit_for</w:t>
+        <w:t>{{suit_for}}</w:t>
       </w:r>
       <w:r>
         <w:rPr>
@@ -4581,7 +4716,7 @@
           <w:rFonts w:ascii="Tahoma" w:hAnsi="Tahoma" w:cs="Tahoma"/>
           <w:noProof/>
         </w:rPr>
-        <w:t>dof</w:t>
+        <w:t>{{dof}}</w:t>
       </w:r>
     </w:p>
     <w:p>
@@ -4647,15 +4782,27 @@
         <w:rPr>
           <w:rFonts w:ascii="Tahoma" w:hAnsi="Tahoma" w:cs="Tahoma"/>
         </w:rPr>
-        <w:lastRenderedPageBreak/>
         <w:t xml:space="preserve">ADVOCATE :: </w:t>
       </w:r>
       <w:r>
         <w:rPr>
           <w:rFonts w:ascii="Tahoma" w:hAnsi="Tahoma" w:cs="Tahoma"/>
+        </w:rPr>
+        <w:t>{{</w:t>
+      </w:r>
+      <w:r>
+        <w:rPr>
+          <w:rFonts w:ascii="Tahoma" w:hAnsi="Tahoma" w:cs="Tahoma"/>
           <w:noProof/>
         </w:rPr>
         <w:t>place</w:t>
+      </w:r>
+      <w:r>
+        <w:rPr>
+          <w:rFonts w:ascii="Tahoma" w:hAnsi="Tahoma" w:cs="Tahoma"/>
+          <w:noProof/>
+        </w:rPr>
+        <w:t>}}</w:t>
       </w:r>
     </w:p>
     <w:p>
@@ -4721,17 +4868,33 @@
           <w:noProof/>
           <w:u w:val="single"/>
         </w:rPr>
+        <w:t>{{</w:t>
+      </w:r>
+      <w:r>
+        <w:rPr>
+          <w:rFonts w:ascii="Tahoma" w:hAnsi="Tahoma" w:cs="Tahoma"/>
+          <w:noProof/>
+          <w:u w:val="single"/>
+        </w:rPr>
         <w:t>court_name</w:t>
       </w:r>
-    </w:p>
-    <w:p>
-      <w:pPr>
-        <w:ind w:left="5040" w:right="-720"/>
-        <w:jc w:val="center"/>
-        <w:rPr>
-          <w:rFonts w:ascii="Tahoma" w:hAnsi="Tahoma" w:cs="Tahoma"/>
+      <w:r>
+        <w:rPr>
+          <w:rFonts w:ascii="Tahoma" w:hAnsi="Tahoma" w:cs="Tahoma"/>
+          <w:noProof/>
           <w:u w:val="single"/>
         </w:rPr>
+        <w:t>}}</w:t>
+      </w:r>
+    </w:p>
+    <w:p>
+      <w:pPr>
+        <w:ind w:left="5040" w:right="-720"/>
+        <w:jc w:val="center"/>
+        <w:rPr>
+          <w:rFonts w:ascii="Tahoma" w:hAnsi="Tahoma" w:cs="Tahoma"/>
+          <w:u w:val="single"/>
+        </w:rPr>
       </w:pPr>
     </w:p>
     <w:p>
@@ -4763,7 +4926,7 @@
           <w:noProof/>
           <w:szCs w:val="16"/>
         </w:rPr>
-        <w:t>year</w:t>
+        <w:t>{{year}}</w:t>
       </w:r>
     </w:p>
     <w:p>
@@ -4828,7 +4991,7 @@
           <w:rFonts w:ascii="Tahoma" w:hAnsi="Tahoma" w:cs="Tahoma"/>
           <w:noProof/>
         </w:rPr>
-        <w:t>pet_name</w:t>
+        <w:t>{{pet_name}}</w:t>
       </w:r>
     </w:p>
     <w:p>
@@ -4892,7 +5055,7 @@
           <w:rFonts w:ascii="Tahoma" w:hAnsi="Tahoma" w:cs="Tahoma"/>
           <w:noProof/>
         </w:rPr>
-        <w:t>res_name</w:t>
+        <w:t>{{res_name}}</w:t>
       </w:r>
     </w:p>
     <w:p>
@@ -5074,7 +5237,7 @@
           <w:rFonts w:ascii="Tahoma" w:hAnsi="Tahoma" w:cs="Tahoma"/>
           <w:noProof/>
         </w:rPr>
-        <w:t>dof</w:t>
+        <w:t>{{dof}}</w:t>
       </w:r>
     </w:p>
     <w:p>
@@ -5136,7 +5299,7 @@
           <w:rFonts w:ascii="Tahoma" w:hAnsi="Tahoma" w:cs="Tahoma"/>
           <w:noProof/>
         </w:rPr>
-        <w:t>address_for_service</w:t>
+        <w:t>{{address_for_service}}</w:t>
       </w:r>
     </w:p>
     <w:p>
@@ -5201,24 +5364,16 @@
           <w:u w:val="single"/>
         </w:rPr>
         <w:lastRenderedPageBreak/>
-        <w:t xml:space="preserve">IN THE COURT OF THE </w:t>
-      </w:r>
-      <w:r>
-        <w:rPr>
-          <w:rFonts w:ascii="Tahoma" w:hAnsi="Tahoma" w:cs="Tahoma"/>
-          <w:noProof/>
+        <w:t>IN THE COURT OF THE {{court_name}}</w:t>
+      </w:r>
+    </w:p>
+    <w:p>
+      <w:pPr>
+        <w:jc w:val="center"/>
+        <w:rPr>
+          <w:rFonts w:ascii="Tahoma" w:hAnsi="Tahoma" w:cs="Tahoma"/>
           <w:u w:val="single"/>
         </w:rPr>
-        <w:t>court_name</w:t>
-      </w:r>
-    </w:p>
-    <w:p>
-      <w:pPr>
-        <w:jc w:val="center"/>
-        <w:rPr>
-          <w:rFonts w:ascii="Tahoma" w:hAnsi="Tahoma" w:cs="Tahoma"/>
-          <w:u w:val="single"/>
-        </w:rPr>
       </w:pPr>
     </w:p>
     <w:p>
@@ -5248,7 +5403,7 @@
           <w:noProof/>
           <w:szCs w:val="16"/>
         </w:rPr>
-        <w:t>year</w:t>
+        <w:t>{{year}}</w:t>
       </w:r>
     </w:p>
     <w:p>
@@ -5301,7 +5456,7 @@
           <w:rFonts w:ascii="Tahoma" w:hAnsi="Tahoma" w:cs="Tahoma"/>
           <w:noProof/>
         </w:rPr>
-        <w:t>pet_name</w:t>
+        <w:t>{{pet_name}}</w:t>
       </w:r>
     </w:p>
     <w:p>
@@ -5352,7 +5507,7 @@
           <w:rFonts w:ascii="Tahoma" w:hAnsi="Tahoma" w:cs="Tahoma"/>
           <w:noProof/>
         </w:rPr>
-        <w:t>res_name</w:t>
+        <w:t>{{res_name}}</w:t>
       </w:r>
     </w:p>
     <w:p>
@@ -5434,8 +5589,8 @@
         <w:tblLook w:val="01E0" w:firstRow="1" w:lastRow="1" w:firstColumn="1" w:lastColumn="1" w:noHBand="0" w:noVBand="0"/>
       </w:tblPr>
       <w:tblGrid>
-        <w:gridCol w:w="4254"/>
-        <w:gridCol w:w="4269"/>
+        <w:gridCol w:w="4256"/>
+        <w:gridCol w:w="4267"/>
       </w:tblGrid>
       <w:tr>
         <w:tc>
@@ -5447,7 +5602,6 @@
               <w:bottom w:val="single" w:sz="4" w:space="0" w:color="auto"/>
               <w:right w:val="single" w:sz="4" w:space="0" w:color="auto"/>
             </w:tcBorders>
-            <w:shd w:val="clear" w:color="auto" w:fill="auto"/>
           </w:tcPr>
           <w:p>
             <w:pPr>
@@ -5478,7 +5632,6 @@
               <w:bottom w:val="single" w:sz="4" w:space="0" w:color="auto"/>
               <w:right w:val="single" w:sz="4" w:space="0" w:color="auto"/>
             </w:tcBorders>
-            <w:shd w:val="clear" w:color="auto" w:fill="auto"/>
           </w:tcPr>
           <w:p>
             <w:pPr>
@@ -5511,7 +5664,6 @@
               <w:bottom w:val="single" w:sz="4" w:space="0" w:color="auto"/>
               <w:right w:val="single" w:sz="4" w:space="0" w:color="auto"/>
             </w:tcBorders>
-            <w:shd w:val="clear" w:color="auto" w:fill="auto"/>
           </w:tcPr>
           <w:p>
             <w:pPr>
@@ -5528,7 +5680,25 @@
                 <w:sz w:val="22"/>
                 <w:szCs w:val="22"/>
               </w:rPr>
+              <w:t>{{</w:t>
+            </w:r>
+            <w:r>
+              <w:rPr>
+                <w:rFonts w:ascii="Tahoma" w:hAnsi="Tahoma" w:cs="Tahoma"/>
+                <w:noProof/>
+                <w:sz w:val="22"/>
+                <w:szCs w:val="22"/>
+              </w:rPr>
               <w:t>petitioner</w:t>
+            </w:r>
+            <w:r>
+              <w:rPr>
+                <w:rFonts w:ascii="Tahoma" w:hAnsi="Tahoma" w:cs="Tahoma"/>
+                <w:noProof/>
+                <w:sz w:val="22"/>
+                <w:szCs w:val="22"/>
+              </w:rPr>
+              <w:t>}}</w:t>
             </w:r>
             <w:r>
               <w:rPr>
@@ -5549,7 +5719,6 @@
               <w:bottom w:val="single" w:sz="4" w:space="0" w:color="auto"/>
               <w:right w:val="single" w:sz="4" w:space="0" w:color="auto"/>
             </w:tcBorders>
-            <w:shd w:val="clear" w:color="auto" w:fill="auto"/>
           </w:tcPr>
           <w:p>
             <w:pPr>
@@ -5566,7 +5735,25 @@
                 <w:sz w:val="22"/>
                 <w:szCs w:val="22"/>
               </w:rPr>
+              <w:t>{{</w:t>
+            </w:r>
+            <w:r>
+              <w:rPr>
+                <w:rFonts w:ascii="Tahoma" w:hAnsi="Tahoma" w:cs="Tahoma"/>
+                <w:noProof/>
+                <w:sz w:val="22"/>
+                <w:szCs w:val="22"/>
+              </w:rPr>
               <w:t>respondent</w:t>
+            </w:r>
+            <w:r>
+              <w:rPr>
+                <w:rFonts w:ascii="Tahoma" w:hAnsi="Tahoma" w:cs="Tahoma"/>
+                <w:noProof/>
+                <w:sz w:val="22"/>
+                <w:szCs w:val="22"/>
+              </w:rPr>
+              <w:t>}}</w:t>
             </w:r>
           </w:p>
           <w:p>
@@ -5619,7 +5806,7 @@
           <w:rFonts w:ascii="Tahoma" w:hAnsi="Tahoma" w:cs="Tahoma"/>
           <w:noProof/>
         </w:rPr>
-        <w:t>dof</w:t>
+        <w:t>{{dof}}</w:t>
       </w:r>
       <w:r>
         <w:rPr>
@@ -5673,10 +5860,23 @@
       <w:r>
         <w:rPr>
           <w:rFonts w:ascii="Tahoma" w:hAnsi="Tahoma" w:cs="Tahoma"/>
+        </w:rPr>
+        <w:t>{{</w:t>
+      </w:r>
+      <w:r>
+        <w:rPr>
+          <w:rFonts w:ascii="Tahoma" w:hAnsi="Tahoma" w:cs="Tahoma"/>
           <w:noProof/>
         </w:rPr>
         <w:t>place</w:t>
       </w:r>
+      <w:r>
+        <w:rPr>
+          <w:rFonts w:ascii="Tahoma" w:hAnsi="Tahoma" w:cs="Tahoma"/>
+          <w:noProof/>
+        </w:rPr>
+        <w:t>}}</w:t>
+      </w:r>
     </w:p>
     <w:p>
       <w:pPr>
@@ -5699,15 +5899,7 @@
           <w:b/>
         </w:rPr>
         <w:lastRenderedPageBreak/>
-        <w:t xml:space="preserve">IN THE COURT OF THE </w:t>
-      </w:r>
-      <w:r>
-        <w:rPr>
-          <w:rFonts w:ascii="Tahoma" w:hAnsi="Tahoma" w:cs="Tahoma"/>
-          <w:b/>
-          <w:noProof/>
-        </w:rPr>
-        <w:t>court_name</w:t>
+        <w:t>IN THE COURT OF THE {{court_name}}</w:t>
       </w:r>
     </w:p>
     <w:p>
@@ -5759,7 +5951,7 @@
           <w:noProof/>
           <w:szCs w:val="16"/>
         </w:rPr>
-        <w:t>year</w:t>
+        <w:t>{{year}}</w:t>
       </w:r>
     </w:p>
     <w:p>
@@ -5795,7 +5987,7 @@
           <w:noProof/>
           <w:szCs w:val="16"/>
         </w:rPr>
-        <w:t>year</w:t>
+        <w:t>{{year}}</w:t>
       </w:r>
     </w:p>
     <w:p>
@@ -5848,7 +6040,7 @@
           <w:rFonts w:ascii="Tahoma" w:hAnsi="Tahoma" w:cs="Tahoma"/>
           <w:noProof/>
         </w:rPr>
-        <w:t>pet_name</w:t>
+        <w:t>{{pet_name}}</w:t>
       </w:r>
     </w:p>
     <w:p>
@@ -5899,7 +6091,7 @@
           <w:rFonts w:ascii="Tahoma" w:hAnsi="Tahoma" w:cs="Tahoma"/>
           <w:noProof/>
         </w:rPr>
-        <w:t>res_name</w:t>
+        <w:t>{{res_name}}</w:t>
       </w:r>
     </w:p>
     <w:p>
@@ -5986,7 +6178,7 @@
           <w:rFonts w:ascii="Tahoma" w:hAnsi="Tahoma" w:cs="Tahoma"/>
           <w:noProof/>
         </w:rPr>
-        <w:t>aff_oath</w:t>
+        <w:t>{{aff_oath}}</w:t>
       </w:r>
       <w:r>
         <w:rPr>
@@ -6217,7 +6409,7 @@
           <w:rFonts w:ascii="Tahoma" w:hAnsi="Tahoma" w:cs="Tahoma"/>
           <w:noProof/>
         </w:rPr>
-        <w:t>dof</w:t>
+        <w:t>{{dof}}</w:t>
       </w:r>
     </w:p>
     <w:p>
@@ -6288,9 +6480,22 @@
       <w:r>
         <w:rPr>
           <w:rFonts w:ascii="Tahoma" w:hAnsi="Tahoma" w:cs="Tahoma"/>
+        </w:rPr>
+        <w:t>{{</w:t>
+      </w:r>
+      <w:r>
+        <w:rPr>
+          <w:rFonts w:ascii="Tahoma" w:hAnsi="Tahoma" w:cs="Tahoma"/>
           <w:noProof/>
         </w:rPr>
         <w:t>place</w:t>
+      </w:r>
+      <w:r>
+        <w:rPr>
+          <w:rFonts w:ascii="Tahoma" w:hAnsi="Tahoma" w:cs="Tahoma"/>
+          <w:noProof/>
+        </w:rPr>
+        <w:t>}}</w:t>
       </w:r>
     </w:p>
     <w:p>
@@ -6319,16 +6524,7 @@
           <w:u w:val="single"/>
         </w:rPr>
         <w:lastRenderedPageBreak/>
-        <w:t xml:space="preserve">IN THE COURT OF THE </w:t>
-      </w:r>
-      <w:r>
-        <w:rPr>
-          <w:rFonts w:ascii="Tahoma" w:hAnsi="Tahoma" w:cs="Tahoma"/>
-          <w:b/>
-          <w:noProof/>
-          <w:u w:val="single"/>
-        </w:rPr>
-        <w:t>court_name</w:t>
+        <w:t>IN THE COURT OF THE {{court_name}}</w:t>
       </w:r>
     </w:p>
     <w:p>
@@ -6369,7 +6565,7 @@
           <w:noProof/>
           <w:szCs w:val="16"/>
         </w:rPr>
-        <w:t>year</w:t>
+        <w:t>{{year}}</w:t>
       </w:r>
     </w:p>
     <w:p>
@@ -6405,7 +6601,7 @@
           <w:noProof/>
           <w:szCs w:val="16"/>
         </w:rPr>
-        <w:t>year</w:t>
+        <w:t>{{year}}</w:t>
       </w:r>
     </w:p>
     <w:p>
@@ -6458,8 +6654,22 @@
           <w:rFonts w:ascii="Tahoma" w:hAnsi="Tahoma" w:cs="Tahoma"/>
           <w:noProof/>
         </w:rPr>
+        <w:t>{{</w:t>
+      </w:r>
+      <w:r>
+        <w:rPr>
+          <w:rFonts w:ascii="Tahoma" w:hAnsi="Tahoma" w:cs="Tahoma"/>
+          <w:noProof/>
+        </w:rPr>
         <w:t>petitioner</w:t>
       </w:r>
+      <w:r>
+        <w:rPr>
+          <w:rFonts w:ascii="Tahoma" w:hAnsi="Tahoma" w:cs="Tahoma"/>
+          <w:noProof/>
+        </w:rPr>
+        <w:t>}}</w:t>
+      </w:r>
     </w:p>
     <w:p>
       <w:pPr>
@@ -6509,7 +6719,21 @@
           <w:rFonts w:ascii="Tahoma" w:hAnsi="Tahoma" w:cs="Tahoma"/>
           <w:noProof/>
         </w:rPr>
+        <w:t>{{</w:t>
+      </w:r>
+      <w:r>
+        <w:rPr>
+          <w:rFonts w:ascii="Tahoma" w:hAnsi="Tahoma" w:cs="Tahoma"/>
+          <w:noProof/>
+        </w:rPr>
         <w:t>respondent</w:t>
+      </w:r>
+      <w:r>
+        <w:rPr>
+          <w:rFonts w:ascii="Tahoma" w:hAnsi="Tahoma" w:cs="Tahoma"/>
+          <w:noProof/>
+        </w:rPr>
+        <w:t>}}</w:t>
       </w:r>
     </w:p>
     <w:p>
@@ -6771,28 +6995,35 @@
           <w:rFonts w:ascii="Tahoma" w:hAnsi="Tahoma" w:cs="Tahoma"/>
           <w:noProof/>
         </w:rPr>
-        <w:t>dof</w:t>
-      </w:r>
-    </w:p>
-    <w:p>
-      <w:pPr>
-        <w:jc w:val="both"/>
-        <w:rPr>
-          <w:rFonts w:ascii="Tahoma" w:hAnsi="Tahoma" w:cs="Tahoma"/>
-        </w:rPr>
-      </w:pPr>
-      <w:r>
-        <w:rPr>
-          <w:rFonts w:ascii="Tahoma" w:hAnsi="Tahoma" w:cs="Tahoma"/>
-          <w:noProof/>
-        </w:rPr>
-        <w:t>place</w:t>
-      </w:r>
-      <w:r>
-        <w:rPr>
-          <w:rFonts w:ascii="Tahoma" w:hAnsi="Tahoma" w:cs="Tahoma"/>
-        </w:rPr>
-        <w:t xml:space="preserve">                                                      Counsel for Petitioner</w:t>
+        <w:t>{{dof}}</w:t>
+      </w:r>
+    </w:p>
+    <w:p>
+      <w:pPr>
+        <w:jc w:val="both"/>
+        <w:rPr>
+          <w:rFonts w:ascii="Tahoma" w:hAnsi="Tahoma" w:cs="Tahoma"/>
+        </w:rPr>
+      </w:pPr>
+      <w:r>
+        <w:rPr>
+          <w:rFonts w:ascii="Tahoma" w:hAnsi="Tahoma" w:cs="Tahoma"/>
+          <w:noProof/>
+        </w:rPr>
+        <w:t xml:space="preserve">Place: </w:t>
+      </w:r>
+      <w:r>
+        <w:rPr>
+          <w:rFonts w:ascii="Tahoma" w:hAnsi="Tahoma" w:cs="Tahoma"/>
+          <w:noProof/>
+        </w:rPr>
+        <w:t>{{place}}</w:t>
+      </w:r>
+      <w:r>
+        <w:rPr>
+          <w:rFonts w:ascii="Tahoma" w:hAnsi="Tahoma" w:cs="Tahoma"/>
+        </w:rPr>
+        <w:t xml:space="preserve">                                                  Counsel for Petitioner</w:t>
       </w:r>
     </w:p>
     <w:p>
@@ -6849,17 +7080,33 @@
           <w:noProof/>
           <w:u w:val="single"/>
         </w:rPr>
+        <w:t>{{</w:t>
+      </w:r>
+      <w:r>
+        <w:rPr>
+          <w:rFonts w:ascii="Tahoma" w:hAnsi="Tahoma" w:cs="Tahoma"/>
+          <w:noProof/>
+          <w:u w:val="single"/>
+        </w:rPr>
         <w:t>court_name</w:t>
       </w:r>
-    </w:p>
-    <w:p>
-      <w:pPr>
-        <w:ind w:left="5040" w:right="-720"/>
-        <w:jc w:val="center"/>
-        <w:rPr>
-          <w:rFonts w:ascii="Tahoma" w:hAnsi="Tahoma" w:cs="Tahoma"/>
+      <w:r>
+        <w:rPr>
+          <w:rFonts w:ascii="Tahoma" w:hAnsi="Tahoma" w:cs="Tahoma"/>
+          <w:noProof/>
           <w:u w:val="single"/>
         </w:rPr>
+        <w:t>}}</w:t>
+      </w:r>
+    </w:p>
+    <w:p>
+      <w:pPr>
+        <w:ind w:left="5040" w:right="-720"/>
+        <w:jc w:val="center"/>
+        <w:rPr>
+          <w:rFonts w:ascii="Tahoma" w:hAnsi="Tahoma" w:cs="Tahoma"/>
+          <w:u w:val="single"/>
+        </w:rPr>
       </w:pPr>
     </w:p>
     <w:p>
@@ -6900,7 +7147,7 @@
           <w:noProof/>
           <w:szCs w:val="16"/>
         </w:rPr>
-        <w:t>year</w:t>
+        <w:t>{{year}}</w:t>
       </w:r>
     </w:p>
     <w:p>
@@ -6938,7 +7185,7 @@
           <w:noProof/>
           <w:szCs w:val="16"/>
         </w:rPr>
-        <w:t>year</w:t>
+        <w:t>{{year}}</w:t>
       </w:r>
     </w:p>
     <w:p>
@@ -7003,7 +7250,7 @@
           <w:rFonts w:ascii="Tahoma" w:hAnsi="Tahoma" w:cs="Tahoma"/>
           <w:noProof/>
         </w:rPr>
-        <w:t>pet_name</w:t>
+        <w:t>{{pet_name}}</w:t>
       </w:r>
     </w:p>
     <w:p>
@@ -7067,7 +7314,7 @@
           <w:rFonts w:ascii="Tahoma" w:hAnsi="Tahoma" w:cs="Tahoma"/>
           <w:noProof/>
         </w:rPr>
-        <w:t>res_name</w:t>
+        <w:t>{{res_name}}</w:t>
       </w:r>
     </w:p>
     <w:p>
@@ -7223,7 +7470,7 @@
           <w:rFonts w:ascii="Tahoma" w:hAnsi="Tahoma" w:cs="Tahoma"/>
           <w:noProof/>
         </w:rPr>
-        <w:t>dof</w:t>
+        <w:t>{{dof}}</w:t>
       </w:r>
     </w:p>
     <w:p>
@@ -7294,7 +7541,7 @@
           <w:rFonts w:ascii="Tahoma" w:hAnsi="Tahoma" w:cs="Tahoma"/>
           <w:noProof/>
         </w:rPr>
-        <w:t>address_for_service</w:t>
+        <w:t>{{address_for_service}}</w:t>
       </w:r>
     </w:p>
     <w:p>
@@ -7412,17 +7659,7 @@
           <w:sz w:val="22"/>
           <w:u w:val="single"/>
         </w:rPr>
-        <w:t xml:space="preserve">IN THE COURT OF THE </w:t>
-      </w:r>
-      <w:r>
-        <w:rPr>
-          <w:rFonts w:ascii="Tahoma" w:hAnsi="Tahoma" w:cs="Tahoma"/>
-          <w:b/>
-          <w:noProof/>
-          <w:sz w:val="22"/>
-          <w:u w:val="single"/>
-        </w:rPr>
-        <w:t>court_name</w:t>
+        <w:t>IN THE COURT OF THE {{court_name}}</w:t>
       </w:r>
     </w:p>
     <w:p>
@@ -7476,7 +7713,7 @@
           <w:noProof/>
           <w:szCs w:val="16"/>
         </w:rPr>
-        <w:t>year</w:t>
+        <w:t>{{year}}</w:t>
       </w:r>
     </w:p>
     <w:p>
@@ -7527,7 +7764,7 @@
           <w:noProof/>
           <w:sz w:val="22"/>
         </w:rPr>
-        <w:t>pet_name</w:t>
+        <w:t>{{pet_name}}</w:t>
       </w:r>
     </w:p>
     <w:p>
@@ -7585,7 +7822,7 @@
           <w:noProof/>
           <w:sz w:val="22"/>
         </w:rPr>
-        <w:t>res_name</w:t>
+        <w:t>{{res_name}}</w:t>
       </w:r>
     </w:p>
     <w:p>
@@ -7646,8 +7883,8 @@
           <w:sz w:val="22"/>
         </w:rPr>
       </w:pPr>
-      <w:smartTag w:uri="urn:schemas-microsoft-com:office:smarttags" w:element="address">
-        <w:smartTag w:uri="urn:schemas-microsoft-com:office:smarttags" w:element="Street">
+      <w:smartTag w:uri="urn:schemas-microsoft-com:office:smarttags" w:element="Street">
+        <w:smartTag w:uri="urn:schemas-microsoft-com:office:smarttags" w:element="address">
           <w:r>
             <w:rPr>
               <w:rFonts w:ascii="Tahoma" w:hAnsi="Tahoma" w:cs="Tahoma"/>
@@ -8467,31 +8704,39 @@
           <w:noProof/>
           <w:sz w:val="22"/>
         </w:rPr>
-        <w:t>dof</w:t>
-      </w:r>
-    </w:p>
-    <w:p>
-      <w:pPr>
-        <w:jc w:val="both"/>
-        <w:rPr>
-          <w:rFonts w:ascii="Tahoma" w:hAnsi="Tahoma" w:cs="Tahoma"/>
-          <w:sz w:val="22"/>
-        </w:rPr>
-      </w:pPr>
-      <w:r>
-        <w:rPr>
-          <w:rFonts w:ascii="Tahoma" w:hAnsi="Tahoma" w:cs="Tahoma"/>
-          <w:noProof/>
-          <w:sz w:val="22"/>
-        </w:rPr>
-        <w:t>place</w:t>
-      </w:r>
-      <w:r>
-        <w:rPr>
-          <w:rFonts w:ascii="Tahoma" w:hAnsi="Tahoma" w:cs="Tahoma"/>
-          <w:sz w:val="22"/>
-        </w:rPr>
-        <w:t xml:space="preserve">                                                              Plaintiff</w:t>
+        <w:t>{{dof}}</w:t>
+      </w:r>
+    </w:p>
+    <w:p>
+      <w:pPr>
+        <w:jc w:val="both"/>
+        <w:rPr>
+          <w:rFonts w:ascii="Tahoma" w:hAnsi="Tahoma" w:cs="Tahoma"/>
+          <w:sz w:val="22"/>
+        </w:rPr>
+      </w:pPr>
+      <w:r>
+        <w:rPr>
+          <w:rFonts w:ascii="Tahoma" w:hAnsi="Tahoma" w:cs="Tahoma"/>
+          <w:noProof/>
+          <w:sz w:val="22"/>
+        </w:rPr>
+        <w:t xml:space="preserve">Place: </w:t>
+      </w:r>
+      <w:r>
+        <w:rPr>
+          <w:rFonts w:ascii="Tahoma" w:hAnsi="Tahoma" w:cs="Tahoma"/>
+          <w:noProof/>
+          <w:sz w:val="22"/>
+        </w:rPr>
+        <w:t>{{place}}</w:t>
+      </w:r>
+      <w:r>
+        <w:rPr>
+          <w:rFonts w:ascii="Tahoma" w:hAnsi="Tahoma" w:cs="Tahoma"/>
+          <w:sz w:val="22"/>
+        </w:rPr>
+        <w:t xml:space="preserve">                                                          Plaintiff</w:t>
       </w:r>
     </w:p>
     <w:p>
@@ -8516,7 +8761,7 @@
           <w:sz w:val="22"/>
         </w:rPr>
         <w:lastRenderedPageBreak/>
-        <w:object w:dxaOrig="1440" w:dyaOrig="1440" w14:anchorId="2D41C3C8">
+        <w:object w:dxaOrig="657" w:dyaOrig="908" w14:anchorId="2D41C3C8">
           <v:shapetype id="_x0000_t75" coordsize="21600,21600" o:spt="75" o:preferrelative="t" path="m@4@5l@4@11@9@11@9@5xe" filled="f" stroked="f">
             <v:stroke joinstyle="miter"/>
             <v:formulas>
@@ -8536,11 +8781,11 @@
             <v:path o:extrusionok="f" gradientshapeok="t" o:connecttype="rect"/>
             <o:lock v:ext="edit" aspectratio="t"/>
           </v:shapetype>
-          <v:shape id="_x0000_s1026" type="#_x0000_t75" style="position:absolute;left:0;text-align:left;margin-left:49910pt;margin-top:49982pt;width:1pt;height:1pt;z-index:251659264">
+          <v:shape id="_x0000_s1026" type="#_x0000_t75" style="position:absolute;left:0;text-align:left;margin-left:49910pt;margin-top:49982pt;width:1pt;height:1pt;z-index:1">
             <v:imagedata r:id="rId5" o:title=""/>
             <w10:wrap type="topAndBottom"/>
           </v:shape>
-          <o:OLEObject Type="Embed" ProgID="Package" ShapeID="_x0000_s1026" DrawAspect="Content" ObjectID="_1831919098" r:id="rId6"/>
+          <o:OLEObject Type="Embed" ProgID="Package" ShapeID="_x0000_s1026" DrawAspect="Content" ObjectID="_1848109870" r:id="rId6"/>
         </w:object>
       </w:r>
       <w:r>
@@ -8611,17 +8856,7 @@
           <w:sz w:val="22"/>
           <w:u w:val="single"/>
         </w:rPr>
-        <w:t xml:space="preserve">IN THE COURT OF THE </w:t>
-      </w:r>
-      <w:r>
-        <w:rPr>
-          <w:rFonts w:ascii="Tahoma" w:hAnsi="Tahoma" w:cs="Tahoma"/>
-          <w:b/>
-          <w:noProof/>
-          <w:sz w:val="22"/>
-          <w:u w:val="single"/>
-        </w:rPr>
-        <w:t>court_name</w:t>
+        <w:t>IN THE COURT OF THE {{court_name}}</w:t>
       </w:r>
     </w:p>
     <w:p>
@@ -8654,7 +8889,7 @@
           <w:noProof/>
           <w:szCs w:val="16"/>
         </w:rPr>
-        <w:t>year</w:t>
+        <w:t>{{year}}</w:t>
       </w:r>
     </w:p>
     <w:p>
@@ -8705,7 +8940,7 @@
           <w:noProof/>
           <w:sz w:val="22"/>
         </w:rPr>
-        <w:t>pet_name</w:t>
+        <w:t>{{pet_name}}</w:t>
       </w:r>
     </w:p>
     <w:p>
@@ -8763,7 +8998,7 @@
           <w:noProof/>
           <w:sz w:val="22"/>
         </w:rPr>
-        <w:t>res_name</w:t>
+        <w:t>{{res_name}}</w:t>
       </w:r>
     </w:p>
     <w:p>
@@ -8863,7 +9098,7 @@
           <w:noProof/>
           <w:sz w:val="22"/>
         </w:rPr>
-        <w:t>suit_for</w:t>
+        <w:t>{{suit_for}}</w:t>
       </w:r>
       <w:r>
         <w:rPr>
@@ -8887,7 +9122,7 @@
           <w:sz w:val="22"/>
           <w:szCs w:val="22"/>
         </w:rPr>
-        <w:t>year</w:t>
+        <w:t>{{year}}</w:t>
       </w:r>
       <w:r>
         <w:rPr>
@@ -8955,7 +9190,7 @@
           <w:sz w:val="22"/>
           <w:szCs w:val="22"/>
         </w:rPr>
-        <w:t>year</w:t>
+        <w:t>{{year}}</w:t>
       </w:r>
     </w:p>
     <w:p>
@@ -9157,17 +9392,7 @@
           <w:sz w:val="22"/>
           <w:u w:val="single"/>
         </w:rPr>
-        <w:t xml:space="preserve">IN THE COURT OF THE </w:t>
-      </w:r>
-      <w:r>
-        <w:rPr>
-          <w:rFonts w:ascii="Tahoma" w:hAnsi="Tahoma" w:cs="Tahoma"/>
-          <w:b/>
-          <w:noProof/>
-          <w:sz w:val="22"/>
-          <w:u w:val="single"/>
-        </w:rPr>
-        <w:t>court_name</w:t>
+        <w:t>IN THE COURT OF THE {{court_name}}</w:t>
       </w:r>
     </w:p>
     <w:p>
@@ -9204,7 +9429,7 @@
           <w:sz w:val="22"/>
           <w:szCs w:val="22"/>
         </w:rPr>
-        <w:t>year</w:t>
+        <w:t>{{year}}</w:t>
       </w:r>
     </w:p>
     <w:p>
@@ -9249,7 +9474,7 @@
           <w:sz w:val="22"/>
           <w:szCs w:val="22"/>
         </w:rPr>
-        <w:t>year</w:t>
+        <w:t>{{year}}</w:t>
       </w:r>
     </w:p>
     <w:p>
@@ -9300,7 +9525,7 @@
           <w:noProof/>
           <w:sz w:val="22"/>
         </w:rPr>
-        <w:t>pet_name</w:t>
+        <w:t>{{pet_name}}</w:t>
       </w:r>
     </w:p>
     <w:p>
@@ -9358,7 +9583,7 @@
           <w:noProof/>
           <w:sz w:val="22"/>
         </w:rPr>
-        <w:t>res_name</w:t>
+        <w:t>{{res_name}}</w:t>
       </w:r>
     </w:p>
     <w:p>
@@ -9504,7 +9729,7 @@
           <w:sz w:val="22"/>
           <w:szCs w:val="16"/>
         </w:rPr>
-        <w:t>year</w:t>
+        <w:t>{{year}}</w:t>
       </w:r>
       <w:r>
         <w:rPr>
@@ -9578,7 +9803,7 @@
           <w:sz w:val="22"/>
           <w:szCs w:val="22"/>
         </w:rPr>
-        <w:t>year</w:t>
+        <w:t>{{year}}</w:t>
       </w:r>
     </w:p>
     <w:p>
@@ -9669,52 +9894,52 @@
           <w:bCs/>
           <w:sz w:val="22"/>
         </w:rPr>
-        <w:t xml:space="preserve">IN THE COURT OF THE </w:t>
-      </w:r>
-      <w:r>
+        <w:t>IN THE COURT OF THE {{court_name}}</w:t>
+      </w:r>
+    </w:p>
+    <w:p>
+      <w:pPr>
+        <w:rPr>
+          <w:rFonts w:ascii="Tahoma" w:hAnsi="Tahoma" w:cs="Tahoma"/>
+          <w:sz w:val="20"/>
+        </w:rPr>
+      </w:pPr>
+    </w:p>
+    <w:p>
+      <w:pPr>
+        <w:jc w:val="center"/>
+        <w:rPr>
+          <w:rFonts w:ascii="Tahoma" w:hAnsi="Tahoma" w:cs="Tahoma"/>
+          <w:sz w:val="22"/>
+          <w:szCs w:val="22"/>
+        </w:rPr>
+      </w:pPr>
+      <w:r>
+        <w:rPr>
+          <w:rFonts w:ascii="Tahoma" w:hAnsi="Tahoma" w:cs="Tahoma"/>
+          <w:sz w:val="22"/>
+          <w:szCs w:val="22"/>
+        </w:rPr>
+        <w:t xml:space="preserve">O.S.NO.                           OF </w:t>
+      </w:r>
+      <w:r>
+        <w:rPr>
+          <w:rFonts w:ascii="Tahoma" w:hAnsi="Tahoma" w:cs="Tahoma"/>
+          <w:noProof/>
+          <w:sz w:val="22"/>
+          <w:szCs w:val="22"/>
+        </w:rPr>
+        <w:t>{{year}}</w:t>
+      </w:r>
+    </w:p>
+    <w:p>
+      <w:pPr>
         <w:rPr>
           <w:rFonts w:ascii="Tahoma" w:hAnsi="Tahoma" w:cs="Tahoma"/>
           <w:b/>
-          <w:noProof/>
-          <w:sz w:val="22"/>
-        </w:rPr>
-        <w:t>court_name</w:t>
-      </w:r>
-    </w:p>
-    <w:p>
-      <w:pPr>
-        <w:rPr>
-          <w:rFonts w:ascii="Tahoma" w:hAnsi="Tahoma" w:cs="Tahoma"/>
-          <w:sz w:val="20"/>
-        </w:rPr>
-      </w:pPr>
-    </w:p>
-    <w:p>
-      <w:pPr>
-        <w:jc w:val="center"/>
-        <w:rPr>
-          <w:rFonts w:ascii="Tahoma" w:hAnsi="Tahoma" w:cs="Tahoma"/>
-          <w:sz w:val="22"/>
-          <w:szCs w:val="22"/>
-        </w:rPr>
-      </w:pPr>
-      <w:r>
-        <w:rPr>
-          <w:rFonts w:ascii="Tahoma" w:hAnsi="Tahoma" w:cs="Tahoma"/>
-          <w:sz w:val="22"/>
-          <w:szCs w:val="22"/>
-        </w:rPr>
-        <w:t xml:space="preserve">O.S.NO.                           OF </w:t>
-      </w:r>
-      <w:r>
-        <w:rPr>
-          <w:rFonts w:ascii="Tahoma" w:hAnsi="Tahoma" w:cs="Tahoma"/>
-          <w:noProof/>
-          <w:sz w:val="22"/>
-          <w:szCs w:val="22"/>
-        </w:rPr>
-        <w:t>year</w:t>
-      </w:r>
+          <w:sz w:val="22"/>
+        </w:rPr>
+      </w:pPr>
     </w:p>
     <w:p>
       <w:pPr>
@@ -9724,48 +9949,39 @@
           <w:sz w:val="22"/>
         </w:rPr>
       </w:pPr>
-    </w:p>
-    <w:p>
-      <w:pPr>
+      <w:r>
         <w:rPr>
           <w:rFonts w:ascii="Tahoma" w:hAnsi="Tahoma" w:cs="Tahoma"/>
           <w:b/>
           <w:sz w:val="22"/>
         </w:rPr>
-      </w:pPr>
-      <w:r>
+        <w:t>Between:-</w:t>
+      </w:r>
+    </w:p>
+    <w:p>
+      <w:pPr>
         <w:rPr>
           <w:rFonts w:ascii="Tahoma" w:hAnsi="Tahoma" w:cs="Tahoma"/>
           <w:b/>
           <w:sz w:val="22"/>
         </w:rPr>
-        <w:t>Between:-</w:t>
-      </w:r>
-    </w:p>
-    <w:p>
-      <w:pPr>
-        <w:rPr>
-          <w:rFonts w:ascii="Tahoma" w:hAnsi="Tahoma" w:cs="Tahoma"/>
-          <w:b/>
-          <w:sz w:val="22"/>
-        </w:rPr>
-      </w:pPr>
-    </w:p>
-    <w:p>
-      <w:pPr>
-        <w:jc w:val="both"/>
-        <w:rPr>
-          <w:rFonts w:ascii="Tahoma" w:hAnsi="Tahoma" w:cs="Tahoma"/>
-          <w:sz w:val="22"/>
-        </w:rPr>
-      </w:pPr>
-      <w:r>
-        <w:rPr>
-          <w:rFonts w:ascii="Tahoma" w:hAnsi="Tahoma" w:cs="Tahoma"/>
-          <w:noProof/>
-          <w:sz w:val="22"/>
-        </w:rPr>
-        <w:t>pet_name</w:t>
+      </w:pPr>
+    </w:p>
+    <w:p>
+      <w:pPr>
+        <w:jc w:val="both"/>
+        <w:rPr>
+          <w:rFonts w:ascii="Tahoma" w:hAnsi="Tahoma" w:cs="Tahoma"/>
+          <w:sz w:val="22"/>
+        </w:rPr>
+      </w:pPr>
+      <w:r>
+        <w:rPr>
+          <w:rFonts w:ascii="Tahoma" w:hAnsi="Tahoma" w:cs="Tahoma"/>
+          <w:noProof/>
+          <w:sz w:val="22"/>
+        </w:rPr>
+        <w:t>{{pet_name}}</w:t>
       </w:r>
     </w:p>
     <w:p>
@@ -9823,7 +10039,7 @@
           <w:noProof/>
           <w:sz w:val="22"/>
         </w:rPr>
-        <w:t>res_name</w:t>
+        <w:t>{{res_name}}</w:t>
       </w:r>
     </w:p>
     <w:p>
@@ -9942,7 +10158,7 @@
           <w:noProof/>
           <w:sz w:val="22"/>
         </w:rPr>
-        <w:t>dof</w:t>
+        <w:t>{{dof}}</w:t>
       </w:r>
     </w:p>
     <w:p>
@@ -9978,7 +10194,7 @@
           <w:noProof/>
           <w:sz w:val="22"/>
         </w:rPr>
-        <w:t>adv_name</w:t>
+        <w:t>{{adv_name}}</w:t>
       </w:r>
     </w:p>
     <w:p>
@@ -10021,7 +10237,23 @@
           <w:noProof/>
           <w:sz w:val="22"/>
         </w:rPr>
+        <w:t>{{</w:t>
+      </w:r>
+      <w:r>
+        <w:rPr>
+          <w:rFonts w:ascii="Tahoma" w:hAnsi="Tahoma" w:cs="Tahoma"/>
+          <w:noProof/>
+          <w:sz w:val="22"/>
+        </w:rPr>
         <w:t>respondent</w:t>
+      </w:r>
+      <w:r>
+        <w:rPr>
+          <w:rFonts w:ascii="Tahoma" w:hAnsi="Tahoma" w:cs="Tahoma"/>
+          <w:noProof/>
+          <w:sz w:val="22"/>
+        </w:rPr>
+        <w:t>}}</w:t>
       </w:r>
     </w:p>
     <w:p>
@@ -10091,7 +10323,7 @@
           <w:noProof/>
           <w:sz w:val="22"/>
         </w:rPr>
-        <w:t>dof</w:t>
+        <w:t>{{dof}}</w:t>
       </w:r>
       <w:r>
         <w:rPr>
@@ -10141,23 +10373,39 @@
           <w:noProof/>
           <w:sz w:val="22"/>
         </w:rPr>
-        <w:t>adv_name</w:t>
-      </w:r>
-    </w:p>
-    <w:p>
-      <w:pPr>
-        <w:rPr>
-          <w:rFonts w:ascii="Tahoma" w:hAnsi="Tahoma" w:cs="Tahoma"/>
-          <w:sz w:val="22"/>
-        </w:rPr>
-      </w:pPr>
-      <w:r>
-        <w:rPr>
-          <w:rFonts w:ascii="Tahoma" w:hAnsi="Tahoma" w:cs="Tahoma"/>
-          <w:noProof/>
-          <w:sz w:val="22"/>
-        </w:rPr>
-        <w:t>place</w:t>
+        <w:t>{{adv_name}}</w:t>
+      </w:r>
+    </w:p>
+    <w:p>
+      <w:pPr>
+        <w:rPr>
+          <w:rFonts w:ascii="Tahoma" w:hAnsi="Tahoma" w:cs="Tahoma"/>
+          <w:sz w:val="22"/>
+        </w:rPr>
+      </w:pPr>
+      <w:r>
+        <w:rPr>
+          <w:rFonts w:ascii="Tahoma" w:hAnsi="Tahoma" w:cs="Tahoma"/>
+          <w:noProof/>
+          <w:sz w:val="22"/>
+        </w:rPr>
+        <w:t>P</w:t>
+      </w:r>
+      <w:r>
+        <w:rPr>
+          <w:rFonts w:ascii="Tahoma" w:hAnsi="Tahoma" w:cs="Tahoma"/>
+          <w:noProof/>
+          <w:sz w:val="22"/>
+        </w:rPr>
+        <w:t>lace</w:t>
+      </w:r>
+      <w:r>
+        <w:rPr>
+          <w:rFonts w:ascii="Tahoma" w:hAnsi="Tahoma" w:cs="Tahoma"/>
+          <w:noProof/>
+          <w:sz w:val="22"/>
+        </w:rPr>
+        <w:t>: {{place}}</w:t>
       </w:r>
       <w:r>
         <w:rPr>
@@ -10267,16 +10515,7 @@
           <w:bCs/>
           <w:u w:val="single"/>
         </w:rPr>
-        <w:t xml:space="preserve">IN THE COURT OF THE </w:t>
-      </w:r>
-      <w:r>
-        <w:rPr>
-          <w:rFonts w:ascii="Tahoma" w:hAnsi="Tahoma" w:cs="Tahoma"/>
-          <w:b/>
-          <w:noProof/>
-          <w:u w:val="single"/>
-        </w:rPr>
-        <w:t>court_name</w:t>
+        <w:t>IN THE COURT OF THE {{court_name}}</w:t>
       </w:r>
     </w:p>
     <w:p>
@@ -10325,7 +10564,7 @@
           <w:noProof/>
           <w:szCs w:val="16"/>
         </w:rPr>
-        <w:t>year</w:t>
+        <w:t>{{year}}</w:t>
       </w:r>
     </w:p>
     <w:p>
@@ -10370,7 +10609,7 @@
           <w:rFonts w:ascii="Tahoma" w:hAnsi="Tahoma" w:cs="Tahoma"/>
           <w:noProof/>
         </w:rPr>
-        <w:t>pet_name</w:t>
+        <w:t>{{pet_name}}</w:t>
       </w:r>
     </w:p>
     <w:p>
@@ -10421,7 +10660,7 @@
           <w:rFonts w:ascii="Tahoma" w:hAnsi="Tahoma" w:cs="Tahoma"/>
           <w:noProof/>
         </w:rPr>
-        <w:t>res_name</w:t>
+        <w:t>{{res_name}}</w:t>
       </w:r>
     </w:p>
     <w:p>
@@ -10473,12 +10712,6 @@
         <w:gridCol w:w="540"/>
       </w:tblGrid>
       <w:tr>
-        <w:tblPrEx>
-          <w:tblCellMar>
-            <w:top w:w="0" w:type="dxa"/>
-            <w:bottom w:w="0" w:type="dxa"/>
-          </w:tblCellMar>
-        </w:tblPrEx>
         <w:trPr>
           <w:cantSplit/>
           <w:trHeight w:val="1016"/>
@@ -10837,8 +11070,8 @@
               </w:rPr>
               <w:t xml:space="preserve">Expenses of </w:t>
             </w:r>
-            <w:smartTag w:uri="urn:schemas-microsoft-com:office:smarttags" w:element="City">
-              <w:smartTag w:uri="urn:schemas-microsoft-com:office:smarttags" w:element="place">
+            <w:smartTag w:uri="urn:schemas-microsoft-com:office:smarttags" w:element="place">
+              <w:smartTag w:uri="urn:schemas-microsoft-com:office:smarttags" w:element="City">
                 <w:r>
                   <w:rPr>
                     <w:rFonts w:ascii="Tahoma" w:hAnsi="Tahoma" w:cs="Tahoma"/>
@@ -10859,12 +11092,6 @@
         </w:tc>
       </w:tr>
       <w:tr>
-        <w:tblPrEx>
-          <w:tblCellMar>
-            <w:top w:w="0" w:type="dxa"/>
-            <w:bottom w:w="0" w:type="dxa"/>
-          </w:tblCellMar>
-        </w:tblPrEx>
         <w:trPr>
           <w:cantSplit/>
           <w:trHeight w:val="1052"/>
@@ -11026,12 +11253,6 @@
         </w:tc>
       </w:tr>
       <w:tr>
-        <w:tblPrEx>
-          <w:tblCellMar>
-            <w:top w:w="0" w:type="dxa"/>
-            <w:bottom w:w="0" w:type="dxa"/>
-          </w:tblCellMar>
-        </w:tblPrEx>
         <w:trPr>
           <w:trHeight w:val="2771"/>
         </w:trPr>
@@ -11066,7 +11287,23 @@
                 <w:noProof/>
                 <w:sz w:val="22"/>
               </w:rPr>
+              <w:t>{{</w:t>
+            </w:r>
+            <w:r>
+              <w:rPr>
+                <w:rFonts w:ascii="Tahoma" w:hAnsi="Tahoma" w:cs="Tahoma"/>
+                <w:noProof/>
+                <w:sz w:val="22"/>
+              </w:rPr>
               <w:t>respondent</w:t>
+            </w:r>
+            <w:r>
+              <w:rPr>
+                <w:rFonts w:ascii="Tahoma" w:hAnsi="Tahoma" w:cs="Tahoma"/>
+                <w:noProof/>
+                <w:sz w:val="22"/>
+              </w:rPr>
+              <w:t>}}</w:t>
             </w:r>
           </w:p>
         </w:tc>
@@ -11212,7 +11449,7 @@
           <w:rFonts w:ascii="Tahoma" w:hAnsi="Tahoma" w:cs="Tahoma"/>
           <w:noProof/>
         </w:rPr>
-        <w:t>dof</w:t>
+        <w:t>{{dof}}</w:t>
       </w:r>
       <w:r>
         <w:rPr>
@@ -11233,7 +11470,21 @@
           <w:rFonts w:ascii="Tahoma" w:hAnsi="Tahoma" w:cs="Tahoma"/>
           <w:noProof/>
         </w:rPr>
-        <w:t>place</w:t>
+        <w:t>P</w:t>
+      </w:r>
+      <w:r>
+        <w:rPr>
+          <w:rFonts w:ascii="Tahoma" w:hAnsi="Tahoma" w:cs="Tahoma"/>
+          <w:noProof/>
+        </w:rPr>
+        <w:t>lace</w:t>
+      </w:r>
+      <w:r>
+        <w:rPr>
+          <w:rFonts w:ascii="Tahoma" w:hAnsi="Tahoma" w:cs="Tahoma"/>
+          <w:noProof/>
+        </w:rPr>
+        <w:t>: {{place}}</w:t>
       </w:r>
     </w:p>
     <w:p>
@@ -11283,8 +11534,24 @@
           <w:noProof/>
           <w:u w:val="single"/>
         </w:rPr>
+        <w:t>{{</w:t>
+      </w:r>
+      <w:r>
+        <w:rPr>
+          <w:rFonts w:ascii="Tahoma" w:hAnsi="Tahoma" w:cs="Tahoma"/>
+          <w:noProof/>
+          <w:u w:val="single"/>
+        </w:rPr>
         <w:t>court_name</w:t>
       </w:r>
+      <w:r>
+        <w:rPr>
+          <w:rFonts w:ascii="Tahoma" w:hAnsi="Tahoma" w:cs="Tahoma"/>
+          <w:noProof/>
+          <w:u w:val="single"/>
+        </w:rPr>
+        <w:t>}}</w:t>
+      </w:r>
     </w:p>
     <w:p>
       <w:pPr>
@@ -11324,7 +11591,7 @@
           <w:noProof/>
           <w:szCs w:val="16"/>
         </w:rPr>
-        <w:t>year</w:t>
+        <w:t>{{year}}</w:t>
       </w:r>
     </w:p>
     <w:p>
@@ -11389,7 +11656,7 @@
           <w:rFonts w:ascii="Tahoma" w:hAnsi="Tahoma" w:cs="Tahoma"/>
           <w:noProof/>
         </w:rPr>
-        <w:t>pet_name</w:t>
+        <w:t>{{pet_name}}</w:t>
       </w:r>
     </w:p>
     <w:p>
@@ -11452,7 +11719,7 @@
           <w:rFonts w:ascii="Tahoma" w:hAnsi="Tahoma" w:cs="Tahoma"/>
           <w:noProof/>
         </w:rPr>
-        <w:t>res_name</w:t>
+        <w:t>{{res_name}}</w:t>
       </w:r>
     </w:p>
     <w:p>
@@ -11635,7 +11902,7 @@
           <w:rFonts w:ascii="Tahoma" w:hAnsi="Tahoma" w:cs="Tahoma"/>
           <w:noProof/>
         </w:rPr>
-        <w:t>dof</w:t>
+        <w:t>{{dof}}</w:t>
       </w:r>
     </w:p>
     <w:p>
@@ -11705,7 +11972,7 @@
           <w:rFonts w:ascii="Tahoma" w:hAnsi="Tahoma" w:cs="Tahoma"/>
           <w:noProof/>
         </w:rPr>
-        <w:t>address_for_service</w:t>
+        <w:t>{{address_for_service}}</w:t>
       </w:r>
     </w:p>
     <w:p>
@@ -11844,21 +12111,49 @@
           <w:bCs/>
           <w:sz w:val="22"/>
         </w:rPr>
-        <w:t xml:space="preserve">IN THE COURT OF THE </w:t>
-      </w:r>
-      <w:r>
+        <w:t>IN THE COURT OF THE {{court_name}}</w:t>
+      </w:r>
+    </w:p>
+    <w:p>
+      <w:pPr>
+        <w:jc w:val="center"/>
         <w:rPr>
           <w:rFonts w:ascii="Tahoma" w:hAnsi="Tahoma" w:cs="Tahoma"/>
           <w:b/>
-          <w:noProof/>
-          <w:sz w:val="22"/>
-        </w:rPr>
-        <w:t>court_name</w:t>
-      </w:r>
-    </w:p>
-    <w:p>
-      <w:pPr>
-        <w:jc w:val="center"/>
+          <w:sz w:val="22"/>
+        </w:rPr>
+      </w:pPr>
+    </w:p>
+    <w:p>
+      <w:pPr>
+        <w:jc w:val="center"/>
+        <w:rPr>
+          <w:rFonts w:ascii="Tahoma" w:hAnsi="Tahoma" w:cs="Tahoma"/>
+          <w:sz w:val="22"/>
+          <w:szCs w:val="22"/>
+        </w:rPr>
+      </w:pPr>
+      <w:r>
+        <w:rPr>
+          <w:rFonts w:ascii="Tahoma" w:hAnsi="Tahoma" w:cs="Tahoma"/>
+          <w:sz w:val="22"/>
+          <w:szCs w:val="22"/>
+        </w:rPr>
+        <w:t xml:space="preserve">O.S.No.                of </w:t>
+      </w:r>
+      <w:r>
+        <w:rPr>
+          <w:rFonts w:ascii="Tahoma" w:hAnsi="Tahoma" w:cs="Tahoma"/>
+          <w:noProof/>
+          <w:sz w:val="22"/>
+          <w:szCs w:val="22"/>
+        </w:rPr>
+        <w:t>{{year}}</w:t>
+      </w:r>
+    </w:p>
+    <w:p>
+      <w:pPr>
+        <w:ind w:left="2880" w:firstLine="720"/>
         <w:rPr>
           <w:rFonts w:ascii="Tahoma" w:hAnsi="Tahoma" w:cs="Tahoma"/>
           <w:b/>
@@ -11868,33 +12163,6 @@
     </w:p>
     <w:p>
       <w:pPr>
-        <w:jc w:val="center"/>
-        <w:rPr>
-          <w:rFonts w:ascii="Tahoma" w:hAnsi="Tahoma" w:cs="Tahoma"/>
-          <w:sz w:val="22"/>
-          <w:szCs w:val="22"/>
-        </w:rPr>
-      </w:pPr>
-      <w:r>
-        <w:rPr>
-          <w:rFonts w:ascii="Tahoma" w:hAnsi="Tahoma" w:cs="Tahoma"/>
-          <w:sz w:val="22"/>
-          <w:szCs w:val="22"/>
-        </w:rPr>
-        <w:t xml:space="preserve">O.S.No.                of </w:t>
-      </w:r>
-      <w:r>
-        <w:rPr>
-          <w:rFonts w:ascii="Tahoma" w:hAnsi="Tahoma" w:cs="Tahoma"/>
-          <w:noProof/>
-          <w:sz w:val="22"/>
-          <w:szCs w:val="22"/>
-        </w:rPr>
-        <w:t>year</w:t>
-      </w:r>
-    </w:p>
-    <w:p>
-      <w:pPr>
         <w:ind w:left="2880" w:firstLine="720"/>
         <w:rPr>
           <w:rFonts w:ascii="Tahoma" w:hAnsi="Tahoma" w:cs="Tahoma"/>
@@ -11905,29 +12173,61 @@
     </w:p>
     <w:p>
       <w:pPr>
-        <w:ind w:left="2880" w:firstLine="720"/>
         <w:rPr>
           <w:rFonts w:ascii="Tahoma" w:hAnsi="Tahoma" w:cs="Tahoma"/>
           <w:b/>
           <w:sz w:val="22"/>
         </w:rPr>
       </w:pPr>
-    </w:p>
-    <w:p>
-      <w:pPr>
+      <w:r>
         <w:rPr>
           <w:rFonts w:ascii="Tahoma" w:hAnsi="Tahoma" w:cs="Tahoma"/>
           <w:b/>
           <w:sz w:val="22"/>
         </w:rPr>
-      </w:pPr>
-      <w:r>
+        <w:t>Between:</w:t>
+      </w:r>
+    </w:p>
+    <w:p>
+      <w:pPr>
         <w:rPr>
           <w:rFonts w:ascii="Tahoma" w:hAnsi="Tahoma" w:cs="Tahoma"/>
           <w:b/>
           <w:sz w:val="22"/>
         </w:rPr>
-        <w:t>Between:</w:t>
+      </w:pPr>
+    </w:p>
+    <w:p>
+      <w:pPr>
+        <w:jc w:val="both"/>
+        <w:rPr>
+          <w:rFonts w:ascii="Tahoma" w:hAnsi="Tahoma" w:cs="Tahoma"/>
+          <w:sz w:val="22"/>
+        </w:rPr>
+      </w:pPr>
+      <w:r>
+        <w:rPr>
+          <w:rFonts w:ascii="Tahoma" w:hAnsi="Tahoma" w:cs="Tahoma"/>
+          <w:noProof/>
+          <w:sz w:val="22"/>
+        </w:rPr>
+        <w:t>{{pet_name}}</w:t>
+      </w:r>
+    </w:p>
+    <w:p>
+      <w:pPr>
+        <w:jc w:val="right"/>
+        <w:rPr>
+          <w:rFonts w:ascii="Tahoma" w:hAnsi="Tahoma" w:cs="Tahoma"/>
+          <w:sz w:val="22"/>
+        </w:rPr>
+      </w:pPr>
+      <w:r>
+        <w:rPr>
+          <w:rFonts w:ascii="Tahoma" w:hAnsi="Tahoma" w:cs="Tahoma"/>
+          <w:sz w:val="22"/>
+        </w:rPr>
+        <w:t>…Petitioner/Plaintiff</w:t>
       </w:r>
     </w:p>
     <w:p>
@@ -11938,56 +12238,23 @@
           <w:sz w:val="22"/>
         </w:rPr>
       </w:pPr>
-    </w:p>
-    <w:p>
-      <w:pPr>
-        <w:jc w:val="both"/>
-        <w:rPr>
-          <w:rFonts w:ascii="Tahoma" w:hAnsi="Tahoma" w:cs="Tahoma"/>
-          <w:sz w:val="22"/>
-        </w:rPr>
-      </w:pPr>
-      <w:r>
-        <w:rPr>
-          <w:rFonts w:ascii="Tahoma" w:hAnsi="Tahoma" w:cs="Tahoma"/>
-          <w:noProof/>
-          <w:sz w:val="22"/>
-        </w:rPr>
-        <w:t>pet_name</w:t>
-      </w:r>
-    </w:p>
-    <w:p>
-      <w:pPr>
-        <w:jc w:val="right"/>
-        <w:rPr>
-          <w:rFonts w:ascii="Tahoma" w:hAnsi="Tahoma" w:cs="Tahoma"/>
-          <w:sz w:val="22"/>
-        </w:rPr>
-      </w:pPr>
-      <w:r>
-        <w:rPr>
-          <w:rFonts w:ascii="Tahoma" w:hAnsi="Tahoma" w:cs="Tahoma"/>
-          <w:sz w:val="22"/>
-        </w:rPr>
-        <w:t>…Petitioner/Plaintiff</w:t>
-      </w:r>
-    </w:p>
-    <w:p>
-      <w:pPr>
+      <w:r>
         <w:rPr>
           <w:rFonts w:ascii="Tahoma" w:hAnsi="Tahoma" w:cs="Tahoma"/>
           <w:b/>
           <w:sz w:val="22"/>
         </w:rPr>
-      </w:pPr>
-      <w:r>
+        <w:t xml:space="preserve">                                                                                                                              </w:t>
+      </w:r>
+    </w:p>
+    <w:p>
+      <w:pPr>
         <w:rPr>
           <w:rFonts w:ascii="Tahoma" w:hAnsi="Tahoma" w:cs="Tahoma"/>
           <w:b/>
           <w:sz w:val="22"/>
         </w:rPr>
-        <w:t xml:space="preserve">                                                                                                                              </w:t>
-      </w:r>
+      </w:pPr>
     </w:p>
     <w:p>
       <w:pPr>
@@ -11997,21 +12264,12 @@
           <w:sz w:val="22"/>
         </w:rPr>
       </w:pPr>
-    </w:p>
-    <w:p>
-      <w:pPr>
+      <w:r>
         <w:rPr>
           <w:rFonts w:ascii="Tahoma" w:hAnsi="Tahoma" w:cs="Tahoma"/>
           <w:b/>
           <w:sz w:val="22"/>
         </w:rPr>
-      </w:pPr>
-      <w:r>
-        <w:rPr>
-          <w:rFonts w:ascii="Tahoma" w:hAnsi="Tahoma" w:cs="Tahoma"/>
-          <w:b/>
-          <w:sz w:val="22"/>
-        </w:rPr>
         <w:t xml:space="preserve">                                                 AND</w:t>
       </w:r>
     </w:p>
@@ -12029,7 +12287,7 @@
           <w:noProof/>
           <w:sz w:val="22"/>
         </w:rPr>
-        <w:t>res_name</w:t>
+        <w:t>{{res_name}}</w:t>
       </w:r>
     </w:p>
     <w:p>
@@ -12715,7 +12973,7 @@
           <w:noProof/>
           <w:sz w:val="22"/>
         </w:rPr>
-        <w:t>dof</w:t>
+        <w:t>{{dof}}</w:t>
       </w:r>
       <w:r>
         <w:rPr>
@@ -12765,23 +13023,47 @@
           <w:noProof/>
           <w:sz w:val="22"/>
         </w:rPr>
-        <w:t>adv_name</w:t>
-      </w:r>
-    </w:p>
-    <w:p>
-      <w:pPr>
-        <w:rPr>
-          <w:rFonts w:ascii="Tahoma" w:hAnsi="Tahoma" w:cs="Tahoma"/>
-          <w:sz w:val="22"/>
-        </w:rPr>
-      </w:pPr>
-      <w:r>
-        <w:rPr>
-          <w:rFonts w:ascii="Tahoma" w:hAnsi="Tahoma" w:cs="Tahoma"/>
-          <w:noProof/>
-          <w:sz w:val="22"/>
-        </w:rPr>
-        <w:t>place</w:t>
+        <w:t>{{adv_name}}</w:t>
+      </w:r>
+    </w:p>
+    <w:p>
+      <w:pPr>
+        <w:rPr>
+          <w:rFonts w:ascii="Tahoma" w:hAnsi="Tahoma" w:cs="Tahoma"/>
+          <w:sz w:val="22"/>
+        </w:rPr>
+      </w:pPr>
+      <w:r>
+        <w:rPr>
+          <w:rFonts w:ascii="Tahoma" w:hAnsi="Tahoma" w:cs="Tahoma"/>
+          <w:noProof/>
+          <w:sz w:val="22"/>
+        </w:rPr>
+        <w:t>P</w:t>
+      </w:r>
+      <w:r>
+        <w:rPr>
+          <w:rFonts w:ascii="Tahoma" w:hAnsi="Tahoma" w:cs="Tahoma"/>
+          <w:noProof/>
+          <w:sz w:val="22"/>
+        </w:rPr>
+        <w:t>lace</w:t>
+      </w:r>
+      <w:r>
+        <w:rPr>
+          <w:rFonts w:ascii="Tahoma" w:hAnsi="Tahoma" w:cs="Tahoma"/>
+          <w:noProof/>
+          <w:sz w:val="22"/>
+        </w:rPr>
+        <w:t xml:space="preserve">: </w:t>
+      </w:r>
+      <w:r>
+        <w:rPr>
+          <w:rFonts w:ascii="Tahoma" w:hAnsi="Tahoma" w:cs="Tahoma"/>
+          <w:noProof/>
+          <w:sz w:val="22"/>
+        </w:rPr>
+        <w:t>{{place}}</w:t>
       </w:r>
       <w:r>
         <w:rPr>
@@ -12860,8 +13142,24 @@
           <w:noProof/>
           <w:u w:val="single"/>
         </w:rPr>
+        <w:t>{{</w:t>
+      </w:r>
+      <w:r>
+        <w:rPr>
+          <w:rFonts w:ascii="Tahoma" w:hAnsi="Tahoma" w:cs="Tahoma"/>
+          <w:noProof/>
+          <w:u w:val="single"/>
+        </w:rPr>
         <w:t>court_name</w:t>
       </w:r>
+      <w:r>
+        <w:rPr>
+          <w:rFonts w:ascii="Tahoma" w:hAnsi="Tahoma" w:cs="Tahoma"/>
+          <w:noProof/>
+          <w:u w:val="single"/>
+        </w:rPr>
+        <w:t>}}</w:t>
+      </w:r>
     </w:p>
     <w:p>
       <w:pPr>
@@ -12901,7 +13199,7 @@
           <w:noProof/>
           <w:szCs w:val="16"/>
         </w:rPr>
-        <w:t>year</w:t>
+        <w:t>{{year}}</w:t>
       </w:r>
     </w:p>
     <w:p>
@@ -12966,7 +13264,7 @@
           <w:rFonts w:ascii="Tahoma" w:hAnsi="Tahoma" w:cs="Tahoma"/>
           <w:noProof/>
         </w:rPr>
-        <w:t>pet_name</w:t>
+        <w:t>{{pet_name}}</w:t>
       </w:r>
     </w:p>
     <w:p>
@@ -13029,7 +13327,7 @@
           <w:rFonts w:ascii="Tahoma" w:hAnsi="Tahoma" w:cs="Tahoma"/>
           <w:noProof/>
         </w:rPr>
-        <w:t>res_name</w:t>
+        <w:t>{{res_name}}</w:t>
       </w:r>
     </w:p>
     <w:p>
@@ -13194,7 +13492,7 @@
           <w:rFonts w:ascii="Tahoma" w:hAnsi="Tahoma" w:cs="Tahoma"/>
           <w:noProof/>
         </w:rPr>
-        <w:t>dof</w:t>
+        <w:t>{{dof}}</w:t>
       </w:r>
     </w:p>
     <w:p>
@@ -13255,7 +13553,7 @@
           <w:rFonts w:ascii="Tahoma" w:hAnsi="Tahoma" w:cs="Tahoma"/>
           <w:noProof/>
         </w:rPr>
-        <w:t>address_for_service</w:t>
+        <w:t>{{address_for_service}}</w:t>
       </w:r>
     </w:p>
     <w:p>
@@ -13330,17 +13628,7 @@
           <w:sz w:val="22"/>
           <w:u w:val="single"/>
         </w:rPr>
-        <w:t xml:space="preserve">IN THE COURT OF THE </w:t>
-      </w:r>
-      <w:r>
-        <w:rPr>
-          <w:rFonts w:ascii="Tahoma" w:hAnsi="Tahoma" w:cs="Tahoma"/>
-          <w:b/>
-          <w:noProof/>
-          <w:sz w:val="22"/>
-          <w:u w:val="single"/>
-        </w:rPr>
-        <w:t>court_name</w:t>
+        <w:t>IN THE COURT OF THE {{court_name}}</w:t>
       </w:r>
     </w:p>
     <w:p>
@@ -13385,7 +13673,7 @@
           <w:sz w:val="22"/>
           <w:szCs w:val="22"/>
         </w:rPr>
-        <w:t>year</w:t>
+        <w:t>{{year}}</w:t>
       </w:r>
     </w:p>
     <w:p>
@@ -13436,7 +13724,7 @@
           <w:noProof/>
           <w:sz w:val="22"/>
         </w:rPr>
-        <w:t>pet_name</w:t>
+        <w:t>{{pet_name}}</w:t>
       </w:r>
     </w:p>
     <w:p>
@@ -13494,7 +13782,7 @@
           <w:noProof/>
           <w:sz w:val="22"/>
         </w:rPr>
-        <w:t>res_name</w:t>
+        <w:t>{{res_name}}</w:t>
       </w:r>
     </w:p>
     <w:p>
@@ -13580,7 +13868,7 @@
           <w:noProof/>
           <w:sz w:val="22"/>
         </w:rPr>
-        <w:t>aff_oath</w:t>
+        <w:t>{{aff_oath}}</w:t>
       </w:r>
       <w:r>
         <w:rPr>
@@ -13670,8 +13958,8 @@
         </w:rPr>
         <w:t xml:space="preserve">3.   The matter is urgent, therefore, the </w:t>
       </w:r>
-      <w:smartTag w:uri="urn:schemas-microsoft-com:office:smarttags" w:element="address">
-        <w:smartTag w:uri="urn:schemas-microsoft-com:office:smarttags" w:element="Street">
+      <w:smartTag w:uri="urn:schemas-microsoft-com:office:smarttags" w:element="Street">
+        <w:smartTag w:uri="urn:schemas-microsoft-com:office:smarttags" w:element="address">
           <w:r>
             <w:rPr>
               <w:rFonts w:ascii="Tahoma" w:hAnsi="Tahoma" w:cs="Tahoma"/>
@@ -13721,7 +14009,7 @@
           <w:noProof/>
           <w:sz w:val="22"/>
         </w:rPr>
-        <w:t>dof</w:t>
+        <w:t>{{dof}}</w:t>
       </w:r>
     </w:p>
     <w:p>
@@ -13739,14 +14027,22 @@
           <w:noProof/>
           <w:sz w:val="22"/>
         </w:rPr>
-        <w:t>place</w:t>
-      </w:r>
-      <w:r>
-        <w:rPr>
-          <w:rFonts w:ascii="Tahoma" w:hAnsi="Tahoma" w:cs="Tahoma"/>
-          <w:sz w:val="22"/>
-        </w:rPr>
-        <w:t xml:space="preserve">                                         </w:t>
+        <w:t xml:space="preserve">Place: </w:t>
+      </w:r>
+      <w:r>
+        <w:rPr>
+          <w:rFonts w:ascii="Tahoma" w:hAnsi="Tahoma" w:cs="Tahoma"/>
+          <w:noProof/>
+          <w:sz w:val="22"/>
+        </w:rPr>
+        <w:t>{{place}}</w:t>
+      </w:r>
+      <w:r>
+        <w:rPr>
+          <w:rFonts w:ascii="Tahoma" w:hAnsi="Tahoma" w:cs="Tahoma"/>
+          <w:sz w:val="22"/>
+        </w:rPr>
+        <w:t xml:space="preserve">                                     </w:t>
       </w:r>
       <w:r>
         <w:rPr>
@@ -13803,7 +14099,7 @@
           <w:noProof/>
           <w:sz w:val="22"/>
         </w:rPr>
-        <w:t>dof</w:t>
+        <w:t>{{dof}}</w:t>
       </w:r>
       <w:r>
         <w:rPr>
@@ -13935,7 +14231,7 @@
           <w:noProof/>
           <w:sz w:val="22"/>
         </w:rPr>
-        <w:t>adv_name</w:t>
+        <w:t>{{adv_name}}</w:t>
       </w:r>
     </w:p>
     <w:p>
@@ -13998,10 +14294,25 @@
       <w:r>
         <w:rPr>
           <w:rFonts w:ascii="Tahoma" w:hAnsi="Tahoma" w:cs="Tahoma"/>
+          <w:sz w:val="22"/>
+        </w:rPr>
+        <w:t>{{</w:t>
+      </w:r>
+      <w:r>
+        <w:rPr>
+          <w:rFonts w:ascii="Tahoma" w:hAnsi="Tahoma" w:cs="Tahoma"/>
           <w:noProof/>
           <w:sz w:val="22"/>
         </w:rPr>
         <w:t>place</w:t>
+      </w:r>
+      <w:r>
+        <w:rPr>
+          <w:rFonts w:ascii="Tahoma" w:hAnsi="Tahoma" w:cs="Tahoma"/>
+          <w:noProof/>
+          <w:sz w:val="22"/>
+        </w:rPr>
+        <w:t>}}</w:t>
       </w:r>
     </w:p>
     <w:p>
@@ -14031,17 +14342,7 @@
           <w:u w:val="single"/>
         </w:rPr>
         <w:lastRenderedPageBreak/>
-        <w:t xml:space="preserve">IN THE COURT OF THE </w:t>
-      </w:r>
-      <w:r>
-        <w:rPr>
-          <w:rFonts w:ascii="Tahoma" w:hAnsi="Tahoma" w:cs="Tahoma"/>
-          <w:b/>
-          <w:noProof/>
-          <w:sz w:val="22"/>
-          <w:u w:val="single"/>
-        </w:rPr>
-        <w:t>court_name</w:t>
+        <w:t>IN THE COURT OF THE {{court_name}}</w:t>
       </w:r>
     </w:p>
     <w:p>
@@ -14086,7 +14387,7 @@
           <w:sz w:val="22"/>
           <w:szCs w:val="22"/>
         </w:rPr>
-        <w:t>year</w:t>
+        <w:t>{{year}}</w:t>
       </w:r>
     </w:p>
     <w:p>
@@ -14131,7 +14432,7 @@
           <w:sz w:val="22"/>
           <w:szCs w:val="22"/>
         </w:rPr>
-        <w:t>year</w:t>
+        <w:t>{{year}}</w:t>
       </w:r>
     </w:p>
     <w:p>
@@ -14191,8 +14492,24 @@
           <w:noProof/>
           <w:sz w:val="22"/>
         </w:rPr>
+        <w:t>{{</w:t>
+      </w:r>
+      <w:r>
+        <w:rPr>
+          <w:rFonts w:ascii="Tahoma" w:hAnsi="Tahoma" w:cs="Tahoma"/>
+          <w:noProof/>
+          <w:sz w:val="22"/>
+        </w:rPr>
         <w:t>petitioner</w:t>
       </w:r>
+      <w:r>
+        <w:rPr>
+          <w:rFonts w:ascii="Tahoma" w:hAnsi="Tahoma" w:cs="Tahoma"/>
+          <w:noProof/>
+          <w:sz w:val="22"/>
+        </w:rPr>
+        <w:t>}}</w:t>
+      </w:r>
     </w:p>
     <w:p>
       <w:pPr>
@@ -14249,7 +14566,23 @@
           <w:noProof/>
           <w:sz w:val="22"/>
         </w:rPr>
+        <w:t>{{</w:t>
+      </w:r>
+      <w:r>
+        <w:rPr>
+          <w:rFonts w:ascii="Tahoma" w:hAnsi="Tahoma" w:cs="Tahoma"/>
+          <w:noProof/>
+          <w:sz w:val="22"/>
+        </w:rPr>
         <w:t>respondent</w:t>
+      </w:r>
+      <w:r>
+        <w:rPr>
+          <w:rFonts w:ascii="Tahoma" w:hAnsi="Tahoma" w:cs="Tahoma"/>
+          <w:noProof/>
+          <w:sz w:val="22"/>
+        </w:rPr>
+        <w:t>}}</w:t>
       </w:r>
     </w:p>
     <w:p>
@@ -14421,31 +14754,39 @@
           <w:noProof/>
           <w:sz w:val="22"/>
         </w:rPr>
-        <w:t>dof</w:t>
-      </w:r>
-    </w:p>
-    <w:p>
-      <w:pPr>
-        <w:jc w:val="both"/>
-        <w:rPr>
-          <w:rFonts w:ascii="Tahoma" w:hAnsi="Tahoma" w:cs="Tahoma"/>
-          <w:sz w:val="22"/>
-        </w:rPr>
-      </w:pPr>
-      <w:r>
-        <w:rPr>
-          <w:rFonts w:ascii="Tahoma" w:hAnsi="Tahoma" w:cs="Tahoma"/>
-          <w:noProof/>
-          <w:sz w:val="22"/>
-        </w:rPr>
-        <w:t>place</w:t>
-      </w:r>
-      <w:r>
-        <w:rPr>
-          <w:rFonts w:ascii="Tahoma" w:hAnsi="Tahoma" w:cs="Tahoma"/>
-          <w:sz w:val="22"/>
-        </w:rPr>
-        <w:t xml:space="preserve">                              </w:t>
+        <w:t>{{dof}}</w:t>
+      </w:r>
+    </w:p>
+    <w:p>
+      <w:pPr>
+        <w:jc w:val="both"/>
+        <w:rPr>
+          <w:rFonts w:ascii="Tahoma" w:hAnsi="Tahoma" w:cs="Tahoma"/>
+          <w:sz w:val="22"/>
+        </w:rPr>
+      </w:pPr>
+      <w:r>
+        <w:rPr>
+          <w:rFonts w:ascii="Tahoma" w:hAnsi="Tahoma" w:cs="Tahoma"/>
+          <w:noProof/>
+          <w:sz w:val="22"/>
+        </w:rPr>
+        <w:t xml:space="preserve">Place: </w:t>
+      </w:r>
+      <w:r>
+        <w:rPr>
+          <w:rFonts w:ascii="Tahoma" w:hAnsi="Tahoma" w:cs="Tahoma"/>
+          <w:noProof/>
+          <w:sz w:val="22"/>
+        </w:rPr>
+        <w:t>{{place}}</w:t>
+      </w:r>
+      <w:r>
+        <w:rPr>
+          <w:rFonts w:ascii="Tahoma" w:hAnsi="Tahoma" w:cs="Tahoma"/>
+          <w:sz w:val="22"/>
+        </w:rPr>
+        <w:t xml:space="preserve">                          </w:t>
       </w:r>
       <w:r>
         <w:rPr>
@@ -14534,8 +14875,26 @@
           <w:sz w:val="22"/>
           <w:u w:val="single"/>
         </w:rPr>
+        <w:t>{{</w:t>
+      </w:r>
+      <w:r>
+        <w:rPr>
+          <w:rFonts w:ascii="Tahoma" w:hAnsi="Tahoma" w:cs="Tahoma"/>
+          <w:noProof/>
+          <w:sz w:val="22"/>
+          <w:u w:val="single"/>
+        </w:rPr>
         <w:t>court_name</w:t>
       </w:r>
+      <w:r>
+        <w:rPr>
+          <w:rFonts w:ascii="Tahoma" w:hAnsi="Tahoma" w:cs="Tahoma"/>
+          <w:noProof/>
+          <w:sz w:val="22"/>
+          <w:u w:val="single"/>
+        </w:rPr>
+        <w:t>}}</w:t>
+      </w:r>
     </w:p>
     <w:p>
       <w:pPr>
@@ -14582,7 +14941,7 @@
           <w:sz w:val="22"/>
           <w:szCs w:val="22"/>
         </w:rPr>
-        <w:t>year</w:t>
+        <w:t>{{year}}</w:t>
       </w:r>
     </w:p>
     <w:p>
@@ -14629,7 +14988,7 @@
           <w:sz w:val="22"/>
           <w:szCs w:val="22"/>
         </w:rPr>
-        <w:t>year</w:t>
+        <w:t>{{year}}</w:t>
       </w:r>
     </w:p>
     <w:p>
@@ -14702,7 +15061,7 @@
           <w:noProof/>
           <w:sz w:val="22"/>
         </w:rPr>
-        <w:t>pet_name</w:t>
+        <w:t>{{pet_name}}</w:t>
       </w:r>
     </w:p>
     <w:p>
@@ -14773,7 +15132,7 @@
           <w:noProof/>
           <w:sz w:val="22"/>
         </w:rPr>
-        <w:t>res_name</w:t>
+        <w:t>{{res_name}}</w:t>
       </w:r>
     </w:p>
     <w:p>
@@ -15003,7 +15362,7 @@
           <w:noProof/>
           <w:sz w:val="22"/>
         </w:rPr>
-        <w:t>dof</w:t>
+        <w:t>{{dof}}</w:t>
       </w:r>
     </w:p>
     <w:p>
@@ -15092,7 +15451,7 @@
           <w:noProof/>
           <w:sz w:val="22"/>
         </w:rPr>
-        <w:t>address_for_service</w:t>
+        <w:t>{{address_for_service}}</w:t>
       </w:r>
     </w:p>
     <w:p>
@@ -15239,7 +15598,7 @@
           <w:sz w:val="22"/>
           <w:szCs w:val="22"/>
         </w:rPr>
-        <w:t>year</w:t>
+        <w:t>{{year}}</w:t>
       </w:r>
     </w:p>
     <w:p>
@@ -15290,7 +15649,7 @@
           <w:noProof/>
           <w:sz w:val="22"/>
         </w:rPr>
-        <w:t>pet_name</w:t>
+        <w:t>{{pet_name}}</w:t>
       </w:r>
     </w:p>
     <w:p>
@@ -15348,7 +15707,7 @@
           <w:noProof/>
           <w:sz w:val="22"/>
         </w:rPr>
-        <w:t>res_name</w:t>
+        <w:t>{{res_name}}</w:t>
       </w:r>
     </w:p>
     <w:p>
@@ -15397,7 +15756,7 @@
           <w:noProof/>
           <w:sz w:val="22"/>
         </w:rPr>
-        <w:t>aff_oath</w:t>
+        <w:t>{{aff_oath}}</w:t>
       </w:r>
       <w:r>
         <w:rPr>
@@ -15434,7 +15793,7 @@
           <w:sz w:val="32"/>
           <w:szCs w:val="32"/>
         </w:rPr>
-        <w:t>adv_name</w:t>
+        <w:t>{{adv_name}}</w:t>
       </w:r>
     </w:p>
     <w:p>
@@ -15601,30 +15960,37 @@
           <w:rFonts w:ascii="Tahoma" w:hAnsi="Tahoma" w:cs="Tahoma"/>
           <w:sz w:val="20"/>
         </w:rPr>
-        <w:t>Identified by Sri _______________________________</w:t>
-      </w:r>
-    </w:p>
-    <w:p>
-      <w:pPr>
-        <w:jc w:val="both"/>
+        <w:t xml:space="preserve">Identified by Sri </w:t>
+      </w:r>
+      <w:r>
         <w:rPr>
           <w:rFonts w:ascii="Tahoma" w:hAnsi="Tahoma" w:cs="Tahoma"/>
           <w:sz w:val="20"/>
         </w:rPr>
-      </w:pPr>
-    </w:p>
-    <w:p>
-      <w:pPr>
+        <w:t>{{adv_name}}</w:t>
+      </w:r>
+    </w:p>
+    <w:p>
+      <w:pPr>
+        <w:jc w:val="both"/>
         <w:rPr>
           <w:rFonts w:ascii="Tahoma" w:hAnsi="Tahoma" w:cs="Tahoma"/>
           <w:sz w:val="20"/>
         </w:rPr>
       </w:pPr>
-      <w:r>
+    </w:p>
+    <w:p>
+      <w:pPr>
         <w:rPr>
           <w:rFonts w:ascii="Tahoma" w:hAnsi="Tahoma" w:cs="Tahoma"/>
           <w:sz w:val="20"/>
         </w:rPr>
+      </w:pPr>
+      <w:r>
+        <w:rPr>
+          <w:rFonts w:ascii="Tahoma" w:hAnsi="Tahoma" w:cs="Tahoma"/>
+          <w:sz w:val="20"/>
+        </w:rPr>
         <w:t xml:space="preserve">Executed  on </w:t>
       </w:r>
       <w:r>
@@ -15633,7 +15999,7 @@
           <w:noProof/>
           <w:sz w:val="20"/>
         </w:rPr>
-        <w:t>dof</w:t>
+        <w:t>{{dof}}</w:t>
       </w:r>
       <w:r>
         <w:rPr>
@@ -15660,24 +16026,39 @@
       <w:r>
         <w:rPr>
           <w:rFonts w:ascii="Tahoma" w:hAnsi="Tahoma" w:cs="Tahoma"/>
-          <w:noProof/>
           <w:sz w:val="20"/>
         </w:rPr>
+        <w:t>{{</w:t>
+      </w:r>
+      <w:r>
+        <w:rPr>
+          <w:rFonts w:ascii="Tahoma" w:hAnsi="Tahoma" w:cs="Tahoma"/>
+          <w:noProof/>
+          <w:sz w:val="20"/>
+        </w:rPr>
         <w:t>place</w:t>
       </w:r>
-    </w:p>
-    <w:p>
-      <w:pPr>
-        <w:rPr>
-          <w:rFonts w:ascii="Tahoma" w:hAnsi="Tahoma" w:cs="Tahoma"/>
+      <w:r>
+        <w:rPr>
+          <w:rFonts w:ascii="Tahoma" w:hAnsi="Tahoma" w:cs="Tahoma"/>
+          <w:noProof/>
           <w:sz w:val="20"/>
         </w:rPr>
-      </w:pPr>
-      <w:r>
+        <w:t>}}</w:t>
+      </w:r>
+    </w:p>
+    <w:p>
+      <w:pPr>
         <w:rPr>
           <w:rFonts w:ascii="Tahoma" w:hAnsi="Tahoma" w:cs="Tahoma"/>
           <w:sz w:val="20"/>
         </w:rPr>
+      </w:pPr>
+      <w:r>
+        <w:rPr>
+          <w:rFonts w:ascii="Tahoma" w:hAnsi="Tahoma" w:cs="Tahoma"/>
+          <w:sz w:val="20"/>
+        </w:rPr>
         <w:br w:type="page"/>
       </w:r>
     </w:p>
@@ -15727,8 +16108,26 @@
           <w:sz w:val="22"/>
           <w:u w:val="single"/>
         </w:rPr>
+        <w:t>{{</w:t>
+      </w:r>
+      <w:r>
+        <w:rPr>
+          <w:rFonts w:ascii="Tahoma" w:hAnsi="Tahoma" w:cs="Tahoma"/>
+          <w:noProof/>
+          <w:sz w:val="22"/>
+          <w:u w:val="single"/>
+        </w:rPr>
         <w:t>court_name</w:t>
       </w:r>
+      <w:r>
+        <w:rPr>
+          <w:rFonts w:ascii="Tahoma" w:hAnsi="Tahoma" w:cs="Tahoma"/>
+          <w:noProof/>
+          <w:sz w:val="22"/>
+          <w:u w:val="single"/>
+        </w:rPr>
+        <w:t>}}</w:t>
+      </w:r>
     </w:p>
     <w:p>
       <w:pPr>
@@ -15775,7 +16174,7 @@
           <w:sz w:val="22"/>
           <w:szCs w:val="22"/>
         </w:rPr>
-        <w:t>year</w:t>
+        <w:t>{{year}}</w:t>
       </w:r>
     </w:p>
     <w:p>
@@ -15848,7 +16247,7 @@
           <w:noProof/>
           <w:sz w:val="22"/>
         </w:rPr>
-        <w:t>pet_name</w:t>
+        <w:t>{{pet_name}}</w:t>
       </w:r>
     </w:p>
     <w:p>
@@ -15919,7 +16318,7 @@
           <w:noProof/>
           <w:sz w:val="22"/>
         </w:rPr>
-        <w:t>res_name</w:t>
+        <w:t>{{res_name}}</w:t>
       </w:r>
     </w:p>
     <w:p>
@@ -16129,7 +16528,7 @@
           <w:noProof/>
           <w:sz w:val="22"/>
         </w:rPr>
-        <w:t>dof</w:t>
+        <w:t>{{dof}}</w:t>
       </w:r>
     </w:p>
     <w:p>
@@ -16198,7 +16597,7 @@
           <w:noProof/>
           <w:sz w:val="22"/>
         </w:rPr>
-        <w:t>address_for_service</w:t>
+        <w:t>{{address_for_service}}</w:t>
       </w:r>
     </w:p>
     <w:p>
@@ -16293,7 +16692,6 @@
         <w:tc>
           <w:tcPr>
             <w:tcW w:w="8393" w:type="dxa"/>
-            <w:shd w:val="clear" w:color="auto" w:fill="auto"/>
           </w:tcPr>
           <w:p>
             <w:pPr>
@@ -16385,7 +16783,7 @@
                 <w:sz w:val="16"/>
                 <w:szCs w:val="16"/>
               </w:rPr>
-              <w:t>dof</w:t>
+              <w:t>{{dof}}</w:t>
             </w:r>
           </w:p>
           <w:p>
@@ -16426,11 +16824,28 @@
             <w:r>
               <w:rPr>
                 <w:rFonts w:ascii="Tahoma" w:hAnsi="Tahoma" w:cs="Tahoma"/>
+                <w:sz w:val="16"/>
+                <w:szCs w:val="16"/>
+              </w:rPr>
+              <w:t>{{</w:t>
+            </w:r>
+            <w:r>
+              <w:rPr>
+                <w:rFonts w:ascii="Tahoma" w:hAnsi="Tahoma" w:cs="Tahoma"/>
                 <w:noProof/>
                 <w:sz w:val="16"/>
                 <w:szCs w:val="16"/>
               </w:rPr>
               <w:t>place</w:t>
+            </w:r>
+            <w:r>
+              <w:rPr>
+                <w:rFonts w:ascii="Tahoma" w:hAnsi="Tahoma" w:cs="Tahoma"/>
+                <w:noProof/>
+                <w:sz w:val="16"/>
+                <w:szCs w:val="16"/>
+              </w:rPr>
+              <w:t>}}</w:t>
             </w:r>
           </w:p>
           <w:p>
@@ -16536,7 +16951,7 @@
                 <w:sz w:val="16"/>
                 <w:szCs w:val="16"/>
               </w:rPr>
-              <w:t>adv_name</w:t>
+              <w:t>{{adv_name}}</w:t>
             </w:r>
           </w:p>
           <w:p>
@@ -16563,7 +16978,7 @@
                 <w:sz w:val="16"/>
                 <w:szCs w:val="16"/>
               </w:rPr>
-              <w:t>year</w:t>
+              <w:t>{{year}}</w:t>
             </w:r>
           </w:p>
           <w:p>
@@ -16599,6 +17014,15 @@
               <w:rPr>
                 <w:rFonts w:ascii="Tahoma" w:hAnsi="Tahoma" w:cs="Tahoma"/>
                 <w:b/>
+                <w:sz w:val="16"/>
+                <w:szCs w:val="16"/>
+              </w:rPr>
+              <w:t>{{</w:t>
+            </w:r>
+            <w:r>
+              <w:rPr>
+                <w:rFonts w:ascii="Tahoma" w:hAnsi="Tahoma" w:cs="Tahoma"/>
+                <w:b/>
                 <w:noProof/>
                 <w:sz w:val="16"/>
                 <w:szCs w:val="16"/>
@@ -16612,7 +17036,7 @@
                 <w:sz w:val="16"/>
                 <w:szCs w:val="16"/>
               </w:rPr>
-              <w:t xml:space="preserve"> </w:t>
+              <w:t>}}</w:t>
             </w:r>
           </w:p>
           <w:p>
@@ -16649,7 +17073,7 @@
                 <w:sz w:val="16"/>
                 <w:szCs w:val="16"/>
               </w:rPr>
-              <w:t>year</w:t>
+              <w:t>{{year}}</w:t>
             </w:r>
           </w:p>
           <w:p>
@@ -16686,7 +17110,7 @@
                 <w:sz w:val="16"/>
                 <w:szCs w:val="16"/>
               </w:rPr>
-              <w:t>pet_name</w:t>
+              <w:t>{{pet_name}}</w:t>
             </w:r>
           </w:p>
           <w:p>
@@ -16741,7 +17165,7 @@
                 <w:sz w:val="16"/>
                 <w:szCs w:val="16"/>
               </w:rPr>
-              <w:t>res_name</w:t>
+              <w:t>{{res_name}}</w:t>
             </w:r>
           </w:p>
           <w:p>
@@ -16787,7 +17211,6 @@
               <w:tc>
                 <w:tcPr>
                   <w:tcW w:w="3423" w:type="dxa"/>
-                  <w:shd w:val="clear" w:color="auto" w:fill="auto"/>
                 </w:tcPr>
                 <w:p>
                   <w:pPr>
@@ -16811,7 +17234,6 @@
               <w:tc>
                 <w:tcPr>
                   <w:tcW w:w="1841" w:type="dxa"/>
-                  <w:shd w:val="clear" w:color="auto" w:fill="auto"/>
                 </w:tcPr>
                 <w:p>
                   <w:pPr>
@@ -16840,7 +17262,6 @@
               <w:tc>
                 <w:tcPr>
                   <w:tcW w:w="3423" w:type="dxa"/>
-                  <w:shd w:val="clear" w:color="auto" w:fill="auto"/>
                 </w:tcPr>
                 <w:p>
                   <w:pPr>
@@ -16864,7 +17285,6 @@
               <w:tc>
                 <w:tcPr>
                   <w:tcW w:w="1841" w:type="dxa"/>
-                  <w:shd w:val="clear" w:color="auto" w:fill="auto"/>
                 </w:tcPr>
                 <w:p>
                   <w:pPr>
@@ -16893,7 +17313,6 @@
               <w:tc>
                 <w:tcPr>
                   <w:tcW w:w="3423" w:type="dxa"/>
-                  <w:shd w:val="clear" w:color="auto" w:fill="auto"/>
                 </w:tcPr>
                 <w:p>
                   <w:pPr>
@@ -16917,7 +17336,6 @@
               <w:tc>
                 <w:tcPr>
                   <w:tcW w:w="1841" w:type="dxa"/>
-                  <w:shd w:val="clear" w:color="auto" w:fill="auto"/>
                 </w:tcPr>
                 <w:p>
                   <w:pPr>
@@ -16946,7 +17364,6 @@
               <w:tc>
                 <w:tcPr>
                   <w:tcW w:w="3423" w:type="dxa"/>
-                  <w:shd w:val="clear" w:color="auto" w:fill="auto"/>
                 </w:tcPr>
                 <w:p>
                   <w:pPr>
@@ -16970,7 +17387,6 @@
               <w:tc>
                 <w:tcPr>
                   <w:tcW w:w="1841" w:type="dxa"/>
-                  <w:shd w:val="clear" w:color="auto" w:fill="auto"/>
                 </w:tcPr>
                 <w:p>
                   <w:pPr>
@@ -16999,7 +17415,6 @@
               <w:tc>
                 <w:tcPr>
                   <w:tcW w:w="3423" w:type="dxa"/>
-                  <w:shd w:val="clear" w:color="auto" w:fill="auto"/>
                 </w:tcPr>
                 <w:p>
                   <w:pPr>
@@ -17015,7 +17430,6 @@
               <w:tc>
                 <w:tcPr>
                   <w:tcW w:w="1841" w:type="dxa"/>
-                  <w:shd w:val="clear" w:color="auto" w:fill="auto"/>
                 </w:tcPr>
                 <w:p>
                   <w:pPr>
@@ -17036,7 +17450,6 @@
               <w:tc>
                 <w:tcPr>
                   <w:tcW w:w="3423" w:type="dxa"/>
-                  <w:shd w:val="clear" w:color="auto" w:fill="auto"/>
                 </w:tcPr>
                 <w:p>
                   <w:pPr>
@@ -17060,7 +17473,6 @@
               <w:tc>
                 <w:tcPr>
                   <w:tcW w:w="1841" w:type="dxa"/>
-                  <w:shd w:val="clear" w:color="auto" w:fill="auto"/>
                 </w:tcPr>
                 <w:p>
                   <w:pPr>
@@ -17144,7 +17556,6 @@
         <w:tc>
           <w:tcPr>
             <w:tcW w:w="8393" w:type="dxa"/>
-            <w:shd w:val="clear" w:color="auto" w:fill="auto"/>
           </w:tcPr>
           <w:p>
             <w:pPr>
@@ -17228,7 +17639,7 @@
                 <w:sz w:val="16"/>
                 <w:szCs w:val="16"/>
               </w:rPr>
-              <w:t>dof</w:t>
+              <w:t>{{dof}}</w:t>
             </w:r>
           </w:p>
           <w:p>
@@ -17269,11 +17680,28 @@
             <w:r>
               <w:rPr>
                 <w:rFonts w:ascii="Tahoma" w:hAnsi="Tahoma" w:cs="Tahoma"/>
+                <w:sz w:val="16"/>
+                <w:szCs w:val="16"/>
+              </w:rPr>
+              <w:t>{{</w:t>
+            </w:r>
+            <w:r>
+              <w:rPr>
+                <w:rFonts w:ascii="Tahoma" w:hAnsi="Tahoma" w:cs="Tahoma"/>
                 <w:noProof/>
                 <w:sz w:val="16"/>
                 <w:szCs w:val="16"/>
               </w:rPr>
               <w:t>place</w:t>
+            </w:r>
+            <w:r>
+              <w:rPr>
+                <w:rFonts w:ascii="Tahoma" w:hAnsi="Tahoma" w:cs="Tahoma"/>
+                <w:noProof/>
+                <w:sz w:val="16"/>
+                <w:szCs w:val="16"/>
+              </w:rPr>
+              <w:t>}}</w:t>
             </w:r>
           </w:p>
           <w:p>
@@ -17380,7 +17808,7 @@
                 <w:sz w:val="16"/>
                 <w:szCs w:val="16"/>
               </w:rPr>
-              <w:t>adv_name</w:t>
+              <w:t>{{adv_name}}</w:t>
             </w:r>
           </w:p>
           <w:p>
@@ -17407,7 +17835,7 @@
                 <w:sz w:val="16"/>
                 <w:szCs w:val="16"/>
               </w:rPr>
-              <w:t>year</w:t>
+              <w:t>{{year}}</w:t>
             </w:r>
           </w:p>
           <w:p>
@@ -17443,6 +17871,15 @@
               <w:rPr>
                 <w:rFonts w:ascii="Tahoma" w:hAnsi="Tahoma" w:cs="Tahoma"/>
                 <w:b/>
+                <w:sz w:val="16"/>
+                <w:szCs w:val="16"/>
+              </w:rPr>
+              <w:t>{{</w:t>
+            </w:r>
+            <w:r>
+              <w:rPr>
+                <w:rFonts w:ascii="Tahoma" w:hAnsi="Tahoma" w:cs="Tahoma"/>
+                <w:b/>
                 <w:noProof/>
                 <w:sz w:val="16"/>
                 <w:szCs w:val="16"/>
@@ -17453,10 +17890,11 @@
               <w:rPr>
                 <w:rFonts w:ascii="Tahoma" w:hAnsi="Tahoma" w:cs="Tahoma"/>
                 <w:b/>
+                <w:noProof/>
                 <w:sz w:val="16"/>
                 <w:szCs w:val="16"/>
               </w:rPr>
-              <w:t xml:space="preserve"> </w:t>
+              <w:t>}}</w:t>
             </w:r>
           </w:p>
           <w:p>
@@ -17493,7 +17931,7 @@
                 <w:sz w:val="16"/>
                 <w:szCs w:val="16"/>
               </w:rPr>
-              <w:t>year</w:t>
+              <w:t>{{year}}</w:t>
             </w:r>
           </w:p>
           <w:p>
@@ -17530,7 +17968,7 @@
                 <w:sz w:val="16"/>
                 <w:szCs w:val="16"/>
               </w:rPr>
-              <w:t>pet_name</w:t>
+              <w:t>{{pet_name}}</w:t>
             </w:r>
           </w:p>
           <w:p>
@@ -17585,7 +18023,7 @@
                 <w:sz w:val="16"/>
                 <w:szCs w:val="16"/>
               </w:rPr>
-              <w:t>res_name</w:t>
+              <w:t>{{res_name}}</w:t>
             </w:r>
           </w:p>
           <w:p>
@@ -17641,7 +18079,6 @@
               <w:tc>
                 <w:tcPr>
                   <w:tcW w:w="3423" w:type="dxa"/>
-                  <w:shd w:val="clear" w:color="auto" w:fill="auto"/>
                 </w:tcPr>
                 <w:p>
                   <w:pPr>
@@ -17665,7 +18102,6 @@
               <w:tc>
                 <w:tcPr>
                   <w:tcW w:w="1841" w:type="dxa"/>
-                  <w:shd w:val="clear" w:color="auto" w:fill="auto"/>
                 </w:tcPr>
                 <w:p>
                   <w:pPr>
@@ -17694,7 +18130,6 @@
               <w:tc>
                 <w:tcPr>
                   <w:tcW w:w="3423" w:type="dxa"/>
-                  <w:shd w:val="clear" w:color="auto" w:fill="auto"/>
                 </w:tcPr>
                 <w:p>
                   <w:pPr>
@@ -17718,7 +18153,6 @@
               <w:tc>
                 <w:tcPr>
                   <w:tcW w:w="1841" w:type="dxa"/>
-                  <w:shd w:val="clear" w:color="auto" w:fill="auto"/>
                 </w:tcPr>
                 <w:p>
                   <w:pPr>
@@ -17747,7 +18181,6 @@
               <w:tc>
                 <w:tcPr>
                   <w:tcW w:w="3423" w:type="dxa"/>
-                  <w:shd w:val="clear" w:color="auto" w:fill="auto"/>
                 </w:tcPr>
                 <w:p>
                   <w:pPr>
@@ -17771,7 +18204,6 @@
               <w:tc>
                 <w:tcPr>
                   <w:tcW w:w="1841" w:type="dxa"/>
-                  <w:shd w:val="clear" w:color="auto" w:fill="auto"/>
                 </w:tcPr>
                 <w:p>
                   <w:pPr>
@@ -17800,7 +18232,6 @@
               <w:tc>
                 <w:tcPr>
                   <w:tcW w:w="3423" w:type="dxa"/>
-                  <w:shd w:val="clear" w:color="auto" w:fill="auto"/>
                 </w:tcPr>
                 <w:p>
                   <w:pPr>
@@ -17824,7 +18255,6 @@
               <w:tc>
                 <w:tcPr>
                   <w:tcW w:w="1841" w:type="dxa"/>
-                  <w:shd w:val="clear" w:color="auto" w:fill="auto"/>
                 </w:tcPr>
                 <w:p>
                   <w:pPr>
@@ -17853,7 +18283,6 @@
               <w:tc>
                 <w:tcPr>
                   <w:tcW w:w="3423" w:type="dxa"/>
-                  <w:shd w:val="clear" w:color="auto" w:fill="auto"/>
                 </w:tcPr>
                 <w:p>
                   <w:pPr>
@@ -17869,7 +18298,6 @@
               <w:tc>
                 <w:tcPr>
                   <w:tcW w:w="1841" w:type="dxa"/>
-                  <w:shd w:val="clear" w:color="auto" w:fill="auto"/>
                 </w:tcPr>
                 <w:p>
                   <w:pPr>
@@ -17890,7 +18318,6 @@
               <w:tc>
                 <w:tcPr>
                   <w:tcW w:w="3423" w:type="dxa"/>
-                  <w:shd w:val="clear" w:color="auto" w:fill="auto"/>
                 </w:tcPr>
                 <w:p>
                   <w:pPr>
@@ -17914,7 +18341,6 @@
               <w:tc>
                 <w:tcPr>
                   <w:tcW w:w="1841" w:type="dxa"/>
-                  <w:shd w:val="clear" w:color="auto" w:fill="auto"/>
                 </w:tcPr>
                 <w:p>
                   <w:pPr>
@@ -18008,8 +18434,8 @@
               </w:rPr>
               <w:t xml:space="preserve">STATE BANK OF </w:t>
             </w:r>
-            <w:smartTag w:uri="urn:schemas-microsoft-com:office:smarttags" w:element="City">
-              <w:smartTag w:uri="urn:schemas-microsoft-com:office:smarttags" w:element="place">
+            <w:smartTag w:uri="urn:schemas-microsoft-com:office:smarttags" w:element="place">
+              <w:smartTag w:uri="urn:schemas-microsoft-com:office:smarttags" w:element="City">
                 <w:r>
                   <w:rPr>
                     <w:rFonts w:ascii="Tahoma" w:hAnsi="Tahoma" w:cs="Tahoma"/>
@@ -18091,7 +18517,7 @@
 </file>
 
 <file path=word/numbering.xml><?xml version="1.0" encoding="utf-8"?>
-<w:numbering xmlns:wpc="http://schemas.microsoft.com/office/word/2010/wordprocessingCanvas" xmlns:cx="http://schemas.microsoft.com/office/drawing/2014/chartex" xmlns:cx1="http://schemas.microsoft.com/office/drawing/2015/9/8/chartex" xmlns:cx2="http://schemas.microsoft.com/office/drawing/2015/10/21/chartex" xmlns:cx3="http://schemas.microsoft.com/office/drawing/2016/5/9/chartex" xmlns:cx4="http://schemas.microsoft.com/office/drawing/2016/5/10/chartex" xmlns:cx5="http://schemas.microsoft.com/office/drawing/2016/5/11/chartex" xmlns:cx6="http://schemas.microsoft.com/office/drawing/2016/5/12/chartex" xmlns:cx7="http://schemas.microsoft.com/office/drawing/2016/5/13/chartex" xmlns:cx8="http://schemas.microsoft.com/office/drawing/2016/5/14/chartex" xmlns:mc="http://schemas.openxmlformats.org/markup-compatibility/2006" xmlns:aink="http://schemas.microsoft.com/office/drawing/2016/ink" xmlns:am3d="http://schemas.microsoft.com/office/drawing/2017/model3d" xmlns:o="urn:schemas-microsoft-com:office:office" xmlns:oel="http://schemas.microsoft.com/office/2019/extlst" xmlns:r="http://schemas.openxmlformats.org/officeDocument/2006/relationships" xmlns:m="http://schemas.openxmlformats.org/officeDocument/2006/math" xmlns:v="urn:schemas-microsoft-com:vml" xmlns:wp14="http://schemas.microsoft.com/office/word/2010/wordprocessingDrawing" xmlns:wp="http://schemas.openxmlformats.org/drawingml/2006/wordprocessingDrawing" xmlns:w10="urn:schemas-microsoft-com:office:word" xmlns:w="http://schemas.openxmlformats.org/wordprocessingml/2006/main" xmlns:w14="http://schemas.microsoft.com/office/word/2010/wordml" xmlns:w15="http://schemas.microsoft.com/office/word/2012/wordml" xmlns:w16cex="http://schemas.microsoft.com/office/word/2018/wordml/cex" xmlns:w16cid="http://schemas.microsoft.com/office/word/2016/wordml/cid" xmlns:w16="http://schemas.microsoft.com/office/word/2018/wordml" xmlns:w16du="http://schemas.microsoft.com/office/word/2023/wordml/word16du" xmlns:w16sdtdh="http://schemas.microsoft.com/office/word/2020/wordml/sdtdatahash" xmlns:w16sdtfl="http://schemas.microsoft.com/office/word/2024/wordml/sdtformatlock" xmlns:w16se="http://schemas.microsoft.com/office/word/2015/wordml/symex" xmlns:wpg="http://schemas.microsoft.com/office/word/2010/wordprocessingGroup" xmlns:wpi="http://schemas.microsoft.com/office/word/2010/wordprocessingInk" xmlns:wne="http://schemas.microsoft.com/office/word/2006/wordml" xmlns:wps="http://schemas.microsoft.com/office/word/2010/wordprocessingShape" mc:Ignorable="w14 w15 w16se w16cid w16 w16cex w16sdtdh w16sdtfl w16du wp14">
+<w:numbering xmlns:wpc="http://schemas.microsoft.com/office/word/2010/wordprocessingCanvas" xmlns:cx="http://schemas.microsoft.com/office/drawing/2014/chartex" xmlns:cx1="http://schemas.microsoft.com/office/drawing/2015/9/8/chartex" xmlns:cx2="http://schemas.microsoft.com/office/drawing/2015/10/21/chartex" xmlns:cx3="http://schemas.microsoft.com/office/drawing/2016/5/9/chartex" xmlns:cx4="http://schemas.microsoft.com/office/drawing/2016/5/10/chartex" xmlns:cx5="http://schemas.microsoft.com/office/drawing/2016/5/11/chartex" xmlns:cx6="http://schemas.microsoft.com/office/drawing/2016/5/12/chartex" xmlns:cx7="http://schemas.microsoft.com/office/drawing/2016/5/13/chartex" xmlns:cx8="http://schemas.microsoft.com/office/drawing/2016/5/14/chartex" xmlns:mc="http://schemas.openxmlformats.org/markup-compatibility/2006" xmlns:aink="http://schemas.microsoft.com/office/drawing/2016/ink" xmlns:am3d="http://schemas.microsoft.com/office/drawing/2017/model3d" xmlns:o="urn:schemas-microsoft-com:office:office" xmlns:oel="http://schemas.microsoft.com/office/2019/extlst" xmlns:r="http://schemas.openxmlformats.org/officeDocument/2006/relationships" xmlns:m="http://schemas.openxmlformats.org/officeDocument/2006/math" xmlns:v="urn:schemas-microsoft-com:vml" xmlns:wp14="http://schemas.microsoft.com/office/word/2010/wordprocessingDrawing" xmlns:wp="http://schemas.openxmlformats.org/drawingml/2006/wordprocessingDrawing" xmlns:w10="urn:schemas-microsoft-com:office:word" xmlns:w="http://schemas.openxmlformats.org/wordprocessingml/2006/main" xmlns:w14="http://schemas.microsoft.com/office/word/2010/wordml" xmlns:w15="http://schemas.microsoft.com/office/word/2012/wordml" xmlns:w16cei="http://schemas.microsoft.com/office/word/2026/wordml/cei" xmlns:w16cex="http://schemas.microsoft.com/office/word/2018/wordml/cex" xmlns:w16cid="http://schemas.microsoft.com/office/word/2016/wordml/cid" xmlns:w16="http://schemas.microsoft.com/office/word/2018/wordml" xmlns:w16du="http://schemas.microsoft.com/office/word/2023/wordml/word16du" xmlns:w16sdtdh="http://schemas.microsoft.com/office/word/2020/wordml/sdtdatahash" xmlns:w16sdtfl="http://schemas.microsoft.com/office/word/2024/wordml/sdtformatlock" xmlns:w16se="http://schemas.microsoft.com/office/word/2015/wordml/symex" xmlns:wpg="http://schemas.microsoft.com/office/word/2010/wordprocessingGroup" xmlns:wpi="http://schemas.microsoft.com/office/word/2010/wordprocessingInk" xmlns:wne="http://schemas.microsoft.com/office/word/2006/wordml" xmlns:wps="http://schemas.microsoft.com/office/word/2010/wordprocessingShape" mc:Ignorable="w14 w15 w16se w16cid w16 w16cex w16sdtdh w16sdtfl w16du wp14">
   <w:abstractNum w:abstractNumId="0" w15:restartNumberingAfterBreak="1">
     <w:nsid w:val="29252DFD"/>
     <w:multiLevelType w:val="hybridMultilevel"/>
@@ -18573,7 +18999,7 @@
     <w:rPrDefault>
       <w:rPr>
         <w:rFonts w:ascii="Times New Roman" w:eastAsia="Times New Roman" w:hAnsi="Times New Roman" w:cs="Times New Roman"/>
-        <w:lang w:val="en-IN" w:eastAsia="en-IN" w:bidi="ar-SA"/>
+        <w:lang w:val="en-GB" w:eastAsia="en-GB" w:bidi="hi-IN"/>
       </w:rPr>
     </w:rPrDefault>
     <w:pPrDefault/>
@@ -18594,7 +19020,51 @@
     <w:lsdException w:name="Subtitle" w:qFormat="1"/>
     <w:lsdException w:name="Strong" w:qFormat="1"/>
     <w:lsdException w:name="Emphasis" w:qFormat="1"/>
+    <w:lsdException w:name="Normal Table" w:semiHidden="1" w:unhideWhenUsed="1"/>
     <w:lsdException w:name="No List" w:uiPriority="99"/>
+    <w:lsdException w:name="Table Simple 1" w:semiHidden="1" w:unhideWhenUsed="1"/>
+    <w:lsdException w:name="Table Simple 2" w:semiHidden="1" w:unhideWhenUsed="1"/>
+    <w:lsdException w:name="Table Simple 3" w:semiHidden="1" w:unhideWhenUsed="1"/>
+    <w:lsdException w:name="Table Classic 1" w:semiHidden="1" w:unhideWhenUsed="1"/>
+    <w:lsdException w:name="Table Classic 2" w:semiHidden="1" w:unhideWhenUsed="1"/>
+    <w:lsdException w:name="Table Classic 3" w:semiHidden="1" w:unhideWhenUsed="1"/>
+    <w:lsdException w:name="Table Classic 4" w:semiHidden="1" w:unhideWhenUsed="1"/>
+    <w:lsdException w:name="Table Colorful 1" w:semiHidden="1" w:unhideWhenUsed="1"/>
+    <w:lsdException w:name="Table Colorful 2" w:semiHidden="1" w:unhideWhenUsed="1"/>
+    <w:lsdException w:name="Table Colorful 3" w:semiHidden="1" w:unhideWhenUsed="1"/>
+    <w:lsdException w:name="Table Columns 1" w:semiHidden="1" w:unhideWhenUsed="1"/>
+    <w:lsdException w:name="Table Columns 2" w:semiHidden="1" w:unhideWhenUsed="1"/>
+    <w:lsdException w:name="Table Columns 3" w:semiHidden="1" w:unhideWhenUsed="1"/>
+    <w:lsdException w:name="Table Columns 4" w:semiHidden="1" w:unhideWhenUsed="1"/>
+    <w:lsdException w:name="Table Columns 5" w:semiHidden="1" w:unhideWhenUsed="1"/>
+    <w:lsdException w:name="Table Grid 1" w:semiHidden="1" w:unhideWhenUsed="1"/>
+    <w:lsdException w:name="Table Grid 2" w:semiHidden="1" w:unhideWhenUsed="1"/>
+    <w:lsdException w:name="Table Grid 3" w:semiHidden="1" w:unhideWhenUsed="1"/>
+    <w:lsdException w:name="Table Grid 4" w:semiHidden="1" w:unhideWhenUsed="1"/>
+    <w:lsdException w:name="Table Grid 5" w:semiHidden="1" w:unhideWhenUsed="1"/>
+    <w:lsdException w:name="Table Grid 6" w:semiHidden="1" w:unhideWhenUsed="1"/>
+    <w:lsdException w:name="Table Grid 7" w:semiHidden="1" w:unhideWhenUsed="1"/>
+    <w:lsdException w:name="Table Grid 8" w:semiHidden="1" w:unhideWhenUsed="1"/>
+    <w:lsdException w:name="Table List 1" w:semiHidden="1" w:unhideWhenUsed="1"/>
+    <w:lsdException w:name="Table List 2" w:semiHidden="1" w:unhideWhenUsed="1"/>
+    <w:lsdException w:name="Table List 3" w:semiHidden="1" w:unhideWhenUsed="1"/>
+    <w:lsdException w:name="Table List 4" w:semiHidden="1" w:unhideWhenUsed="1"/>
+    <w:lsdException w:name="Table List 5" w:semiHidden="1" w:unhideWhenUsed="1"/>
+    <w:lsdException w:name="Table List 6" w:semiHidden="1" w:unhideWhenUsed="1"/>
+    <w:lsdException w:name="Table List 7" w:semiHidden="1" w:unhideWhenUsed="1"/>
+    <w:lsdException w:name="Table List 8" w:semiHidden="1" w:unhideWhenUsed="1"/>
+    <w:lsdException w:name="Table 3D effects 1" w:semiHidden="1" w:unhideWhenUsed="1"/>
+    <w:lsdException w:name="Table 3D effects 2" w:semiHidden="1" w:unhideWhenUsed="1"/>
+    <w:lsdException w:name="Table 3D effects 3" w:semiHidden="1" w:unhideWhenUsed="1"/>
+    <w:lsdException w:name="Table Contemporary" w:semiHidden="1" w:unhideWhenUsed="1"/>
+    <w:lsdException w:name="Table Elegant" w:semiHidden="1" w:unhideWhenUsed="1"/>
+    <w:lsdException w:name="Table Professional" w:semiHidden="1" w:unhideWhenUsed="1"/>
+    <w:lsdException w:name="Table Subtle 1" w:semiHidden="1" w:unhideWhenUsed="1"/>
+    <w:lsdException w:name="Table Subtle 2" w:semiHidden="1" w:unhideWhenUsed="1"/>
+    <w:lsdException w:name="Table Web 1" w:semiHidden="1" w:unhideWhenUsed="1"/>
+    <w:lsdException w:name="Table Web 2" w:semiHidden="1" w:unhideWhenUsed="1"/>
+    <w:lsdException w:name="Table Web 3" w:semiHidden="1" w:unhideWhenUsed="1"/>
+    <w:lsdException w:name="Table Theme" w:semiHidden="1" w:unhideWhenUsed="1"/>
     <w:lsdException w:name="Placeholder Text" w:semiHidden="1" w:uiPriority="99"/>
     <w:lsdException w:name="No Spacing" w:uiPriority="1" w:qFormat="1"/>
     <w:lsdException w:name="Light Shading" w:uiPriority="60"/>
@@ -18822,7 +19292,7 @@
     <w:rPr>
       <w:sz w:val="24"/>
       <w:szCs w:val="24"/>
-      <w:lang w:val="en-US" w:eastAsia="en-US"/>
+      <w:lang w:val="en-US" w:eastAsia="en-US" w:bidi="ar-SA"/>
     </w:rPr>
   </w:style>
   <w:style w:type="paragraph" w:styleId="Heading1">
@@ -18981,11 +19451,14 @@
   </w:style>
   <w:style w:type="character" w:default="1" w:styleId="DefaultParagraphFont">
     <w:name w:val="Default Paragraph Font"/>
-    <w:semiHidden/>
+    <w:uiPriority w:val="1"/>
+    <w:unhideWhenUsed/>
   </w:style>
   <w:style w:type="table" w:default="1" w:styleId="TableNormal">
     <w:name w:val="Normal Table"/>
+    <w:uiPriority w:val="99"/>
     <w:semiHidden/>
+    <w:unhideWhenUsed/>
     <w:tblPr>
       <w:tblInd w:w="0" w:type="dxa"/>
       <w:tblCellMar>
@@ -19000,6 +19473,7 @@
     <w:name w:val="No List"/>
     <w:uiPriority w:val="99"/>
     <w:semiHidden/>
+    <w:unhideWhenUsed/>
   </w:style>
   <w:style w:type="character" w:customStyle="1" w:styleId="Heading1Char">
     <w:name w:val="Heading 1 Char"/>

</xml_diff>